<commit_message>
fix(legal): 按 OPPO 要求修正支付 SDK 公示
</commit_message>
<xml_diff>
--- a/docs/legal/爱买买法律文本审核稿.docx
+++ b/docs/legal/爱买买法律文本审核稿.docx
@@ -253,7 +253,7 @@
         <w:t xml:space="preserve">版本</w:t>
       </w:r>
       <w:r>
-        <w:t xml:space="preserve"> v1.0.1 </w:t>
+        <w:t xml:space="preserve"> v1.0.2 </w:t>
       </w:r>
       <w:r>
         <w:rPr>
@@ -2247,7 +2247,7 @@
         <w:rPr>
           <w:rFonts w:hint="eastAsia"/>
         </w:rPr>
-        <w:t xml:space="preserve">支付类</w:t>
+        <w:t xml:space="preserve">支付与账号登录类</w:t>
       </w:r>
     </w:p>
     <w:p>
@@ -2261,7 +2261,30 @@
         <w:rPr>
           <w:rFonts w:hint="eastAsia"/>
         </w:rPr>
-        <w:t xml:space="preserve">微信支付（微信开放平台，腾讯公司）—</w:t>
+        <w:t xml:space="preserve">SDK名称：APP支付客户端SDK；开发者：支付宝(杭州)信息技术有限公司；收集信息范围：设备信息、网络信息、支付订单信息；目的：完成支付宝</w:t>
+      </w:r>
+      <w:r>
+        <w:t xml:space="preserve"> App </w:t>
+      </w:r>
+      <w:r>
+        <w:rPr>
+          <w:rFonts w:hint="eastAsia"/>
+        </w:rPr>
+        <w:t xml:space="preserve">支付、订单退款、消费积分提现到账能力；SDK隐私政策链接：https://opendocs.alipay.com/open/54/01g6qm#%E6%94%AF%E4%BB%98%E5%AE%9D%20App%20%E6%94%AF%E4%BB%98%E5%AE%A2%E6%88%B7%E7%AB%AF%20SDK%20%E9%9A%90%E7%A7%81%E6%94%BF%E7%AD%96</w:t>
+      </w:r>
+    </w:p>
+    <w:p>
+      <w:pPr>
+        <w:numPr>
+          <w:ilvl w:val="0"/>
+          <w:numId w:val="1016"/>
+        </w:numPr>
+      </w:pPr>
+      <w:r>
+        <w:rPr>
+          <w:rFonts w:hint="eastAsia"/>
+        </w:rPr>
+        <w:t xml:space="preserve">SDK名称：微信OpenSDK</w:t>
       </w:r>
       <w:r>
         <w:t xml:space="preserve"> </w:t>
@@ -2270,21 +2293,42 @@
         <w:rPr>
           <w:rFonts w:hint="eastAsia"/>
         </w:rPr>
-        <w:t xml:space="preserve">用途：完成订单支付；共享字段：订单号、金额；隐私政策：https://www.tenpay.com/v3/helpcenter/low/privacy.shtml</w:t>
-      </w:r>
-    </w:p>
-    <w:p>
-      <w:pPr>
-        <w:numPr>
-          <w:ilvl w:val="0"/>
-          <w:numId w:val="1016"/>
-        </w:numPr>
-      </w:pPr>
-      <w:r>
-        <w:rPr>
-          <w:rFonts w:hint="eastAsia"/>
-        </w:rPr>
-        <w:t xml:space="preserve">支付宝支付（支付宝（中国）网络技术有限公司）—</w:t>
+        <w:t xml:space="preserve">Android；开发者：深圳市腾讯计算机系统有限公司；收集信息范围：设备信息、网络信息、微信账号授权信息、支付订单信息；目的：完成微信授权登录、微信</w:t>
+      </w:r>
+      <w:r>
+        <w:t xml:space="preserve"> App </w:t>
+      </w:r>
+      <w:r>
+        <w:rPr>
+          <w:rFonts w:hint="eastAsia"/>
+        </w:rPr>
+        <w:t xml:space="preserve">支付及相关支付结果回调能力；SDK隐私政策链接：https://support.weixin.qq.com/cgi-bin/mmsupportacctnodeweb-bin/pages/RYiYJkLOrQwu0nb8</w:t>
+      </w:r>
+    </w:p>
+    <w:p>
+      <w:pPr>
+        <w:pStyle w:val="BlockText"/>
+      </w:pPr>
+      <w:r>
+        <w:rPr>
+          <w:rFonts w:hint="eastAsia"/>
+        </w:rPr>
+        <w:t xml:space="preserve">短信与验证类</w:t>
+      </w:r>
+    </w:p>
+    <w:p>
+      <w:pPr>
+        <w:pStyle w:val="Compact"/>
+        <w:numPr>
+          <w:ilvl w:val="0"/>
+          <w:numId w:val="1017"/>
+        </w:numPr>
+      </w:pPr>
+      <w:r>
+        <w:rPr>
+          <w:rFonts w:hint="eastAsia"/>
+        </w:rPr>
+        <w:t xml:space="preserve">阿里云短信服务（阿里云计算有限公司）—</w:t>
       </w:r>
       <w:r>
         <w:t xml:space="preserve"> </w:t>
@@ -2293,7 +2337,32 @@
         <w:rPr>
           <w:rFonts w:hint="eastAsia"/>
         </w:rPr>
-        <w:t xml:space="preserve">用途：完成订单支付、分润提现；共享字段：订单号、金额、收款账户；SDK</w:t>
+        <w:t xml:space="preserve">用途：下发短信验证码；共享字段：手机号、验证码；隐私政策：https://terms.aliyun.com/legal-agreement/terms/suit_bu1_ali_cloud/suit_bu1_ali_cloud202112071754_83380.html</w:t>
+      </w:r>
+    </w:p>
+    <w:p>
+      <w:pPr>
+        <w:pStyle w:val="BlockText"/>
+      </w:pPr>
+      <w:r>
+        <w:rPr>
+          <w:rFonts w:hint="eastAsia"/>
+        </w:rPr>
+        <w:t xml:space="preserve">存储与基础设施</w:t>
+      </w:r>
+    </w:p>
+    <w:p>
+      <w:pPr>
+        <w:numPr>
+          <w:ilvl w:val="0"/>
+          <w:numId w:val="1018"/>
+        </w:numPr>
+      </w:pPr>
+      <w:r>
+        <w:rPr>
+          <w:rFonts w:hint="eastAsia"/>
+        </w:rPr>
+        <w:t xml:space="preserve">阿里云对象存储</w:t>
       </w:r>
       <w:r>
         <w:t xml:space="preserve"> </w:t>
@@ -2302,16 +2371,39 @@
         <w:rPr>
           <w:rFonts w:hint="eastAsia"/>
         </w:rPr>
-        <w:t xml:space="preserve">名称：</w:t>
-      </w:r>
-      <w:r>
-        <w:t xml:space="preserve">@uiw/react-native-alipay</w:t>
-      </w:r>
-      <w:r>
-        <w:rPr>
-          <w:rFonts w:hint="eastAsia"/>
-        </w:rPr>
-        <w:t xml:space="preserve">；隐私政策：https://render.alipay.com/p/c/k2cx0tg8</w:t>
+        <w:t xml:space="preserve">OSS（阿里云计算有限公司）—</w:t>
+      </w:r>
+      <w:r>
+        <w:t xml:space="preserve"> </w:t>
+      </w:r>
+      <w:r>
+        <w:rPr>
+          <w:rFonts w:hint="eastAsia"/>
+        </w:rPr>
+        <w:t xml:space="preserve">用途：图片、视频、文件存储；共享字段：您上传的图片/文件内容</w:t>
+      </w:r>
+    </w:p>
+    <w:p>
+      <w:pPr>
+        <w:numPr>
+          <w:ilvl w:val="0"/>
+          <w:numId w:val="1018"/>
+        </w:numPr>
+      </w:pPr>
+      <w:r>
+        <w:rPr>
+          <w:rFonts w:hint="eastAsia"/>
+        </w:rPr>
+        <w:t xml:space="preserve">阿里云</w:t>
+      </w:r>
+      <w:r>
+        <w:t xml:space="preserve"> ECS / RDS — </w:t>
+      </w:r>
+      <w:r>
+        <w:rPr>
+          <w:rFonts w:hint="eastAsia"/>
+        </w:rPr>
+        <w:t xml:space="preserve">用途：服务器与数据库托管；共享字段：所有业务数据（加密存储）</w:t>
       </w:r>
     </w:p>
     <w:p>
@@ -2322,7 +2414,7 @@
         <w:rPr>
           <w:rFonts w:hint="eastAsia"/>
         </w:rPr>
-        <w:t xml:space="preserve">账号登录类</w:t>
+        <w:t xml:space="preserve">地图与位置类</w:t>
       </w:r>
     </w:p>
     <w:p>
@@ -2330,14 +2422,14 @@
         <w:pStyle w:val="Compact"/>
         <w:numPr>
           <w:ilvl w:val="0"/>
-          <w:numId w:val="1017"/>
-        </w:numPr>
-      </w:pPr>
-      <w:r>
-        <w:rPr>
-          <w:rFonts w:hint="eastAsia"/>
-        </w:rPr>
-        <w:t xml:space="preserve">微信开放平台</w:t>
+          <w:numId w:val="1019"/>
+        </w:numPr>
+      </w:pPr>
+      <w:r>
+        <w:rPr>
+          <w:rFonts w:hint="eastAsia"/>
+        </w:rPr>
+        <w:t xml:space="preserve">高德地图开放平台（高德软件有限公司）—</w:t>
       </w:r>
       <w:r>
         <w:t xml:space="preserve"> </w:t>
@@ -2346,7 +2438,7 @@
         <w:rPr>
           <w:rFonts w:hint="eastAsia"/>
         </w:rPr>
-        <w:t xml:space="preserve">SDK（腾讯公司）—</w:t>
+        <w:t xml:space="preserve">用途：地址解析、POI</w:t>
       </w:r>
       <w:r>
         <w:t xml:space="preserve"> </w:t>
@@ -2355,7 +2447,7 @@
         <w:rPr>
           <w:rFonts w:hint="eastAsia"/>
         </w:rPr>
-        <w:t xml:space="preserve">用途：微信授权登录；共享字段：OpenID、UnionID、昵称、头像；隐私政策：https://privacy.qq.com/</w:t>
+        <w:t xml:space="preserve">搜索、地图展示；共享字段：经纬度、地址文本；隐私政策：https://lbs.amap.com/pages/privacy/</w:t>
       </w:r>
     </w:p>
     <w:p>
@@ -2366,7 +2458,16 @@
         <w:rPr>
           <w:rFonts w:hint="eastAsia"/>
         </w:rPr>
-        <w:t xml:space="preserve">短信与验证类</w:t>
+        <w:t xml:space="preserve">语音与</w:t>
+      </w:r>
+      <w:r>
+        <w:t xml:space="preserve"> AI </w:t>
+      </w:r>
+      <w:r>
+        <w:rPr>
+          <w:rFonts w:hint="eastAsia"/>
+        </w:rPr>
+        <w:t xml:space="preserve">类</w:t>
       </w:r>
     </w:p>
     <w:p>
@@ -2374,14 +2475,14 @@
         <w:pStyle w:val="Compact"/>
         <w:numPr>
           <w:ilvl w:val="0"/>
-          <w:numId w:val="1018"/>
-        </w:numPr>
-      </w:pPr>
-      <w:r>
-        <w:rPr>
-          <w:rFonts w:hint="eastAsia"/>
-        </w:rPr>
-        <w:t xml:space="preserve">阿里云短信服务（阿里云计算有限公司）—</w:t>
+          <w:numId w:val="1020"/>
+        </w:numPr>
+      </w:pPr>
+      <w:r>
+        <w:rPr>
+          <w:rFonts w:hint="eastAsia"/>
+        </w:rPr>
+        <w:t xml:space="preserve">大语言模型服务（供应商待定）—</w:t>
       </w:r>
       <w:r>
         <w:t xml:space="preserve"> </w:t>
@@ -2390,7 +2491,16 @@
         <w:rPr>
           <w:rFonts w:hint="eastAsia"/>
         </w:rPr>
-        <w:t xml:space="preserve">用途：下发短信验证码；共享字段：手机号、验证码；隐私政策：https://terms.aliyun.com/legal-agreement/terms/suit_bu1_ali_cloud/suit_bu1_ali_cloud202112071754_83380.html</w:t>
+        <w:t xml:space="preserve">用途：AI</w:t>
+      </w:r>
+      <w:r>
+        <w:t xml:space="preserve"> </w:t>
+      </w:r>
+      <w:r>
+        <w:rPr>
+          <w:rFonts w:hint="eastAsia"/>
+        </w:rPr>
+        <w:t xml:space="preserve">客服、意图识别、智能搜索；共享字段：脱敏后的文本对话</w:t>
       </w:r>
     </w:p>
     <w:p>
@@ -2401,21 +2511,21 @@
         <w:rPr>
           <w:rFonts w:hint="eastAsia"/>
         </w:rPr>
-        <w:t xml:space="preserve">存储与基础设施</w:t>
-      </w:r>
-    </w:p>
-    <w:p>
-      <w:pPr>
-        <w:numPr>
-          <w:ilvl w:val="0"/>
-          <w:numId w:val="1019"/>
-        </w:numPr>
-      </w:pPr>
-      <w:r>
-        <w:rPr>
-          <w:rFonts w:hint="eastAsia"/>
-        </w:rPr>
-        <w:t xml:space="preserve">阿里云对象存储</w:t>
+        <w:t xml:space="preserve">物流类</w:t>
+      </w:r>
+    </w:p>
+    <w:p>
+      <w:pPr>
+        <w:numPr>
+          <w:ilvl w:val="0"/>
+          <w:numId w:val="1021"/>
+        </w:numPr>
+      </w:pPr>
+      <w:r>
+        <w:rPr>
+          <w:rFonts w:hint="eastAsia"/>
+        </w:rPr>
+        <w:t xml:space="preserve">顺丰开放平台（顺丰速运有限公司）—</w:t>
       </w:r>
       <w:r>
         <w:t xml:space="preserve"> </w:t>
@@ -2424,7 +2534,21 @@
         <w:rPr>
           <w:rFonts w:hint="eastAsia"/>
         </w:rPr>
-        <w:t xml:space="preserve">OSS（阿里云计算有限公司）—</w:t>
+        <w:t xml:space="preserve">用途：物流下单、运单查询；共享字段：收件人姓名、脱敏手机号、地址</w:t>
+      </w:r>
+    </w:p>
+    <w:p>
+      <w:pPr>
+        <w:numPr>
+          <w:ilvl w:val="0"/>
+          <w:numId w:val="1021"/>
+        </w:numPr>
+      </w:pPr>
+      <w:r>
+        <w:rPr>
+          <w:rFonts w:hint="eastAsia"/>
+        </w:rPr>
+        <w:t xml:space="preserve">快递</w:t>
       </w:r>
       <w:r>
         <w:t xml:space="preserve"> </w:t>
@@ -2433,30 +2557,16 @@
         <w:rPr>
           <w:rFonts w:hint="eastAsia"/>
         </w:rPr>
-        <w:t xml:space="preserve">用途：图片、视频、文件存储；共享字段：您上传的图片/文件内容</w:t>
-      </w:r>
-    </w:p>
-    <w:p>
-      <w:pPr>
-        <w:numPr>
-          <w:ilvl w:val="0"/>
-          <w:numId w:val="1019"/>
-        </w:numPr>
-      </w:pPr>
-      <w:r>
-        <w:rPr>
-          <w:rFonts w:hint="eastAsia"/>
-        </w:rPr>
-        <w:t xml:space="preserve">阿里云</w:t>
-      </w:r>
-      <w:r>
-        <w:t xml:space="preserve"> ECS / RDS — </w:t>
-      </w:r>
-      <w:r>
-        <w:rPr>
-          <w:rFonts w:hint="eastAsia"/>
-        </w:rPr>
-        <w:t xml:space="preserve">用途：服务器与数据库托管；共享字段：所有业务数据（加密存储）</w:t>
+        <w:t xml:space="preserve">100（深圳市快递壹佰网络科技有限公司）—</w:t>
+      </w:r>
+      <w:r>
+        <w:t xml:space="preserve"> </w:t>
+      </w:r>
+      <w:r>
+        <w:rPr>
+          <w:rFonts w:hint="eastAsia"/>
+        </w:rPr>
+        <w:t xml:space="preserve">用途：物流轨迹查询；共享字段：运单号</w:t>
       </w:r>
     </w:p>
     <w:p>
@@ -2467,22 +2577,24 @@
         <w:rPr>
           <w:rFonts w:hint="eastAsia"/>
         </w:rPr>
-        <w:t xml:space="preserve">地图与位置类</w:t>
-      </w:r>
-    </w:p>
-    <w:p>
-      <w:pPr>
-        <w:pStyle w:val="Compact"/>
-        <w:numPr>
-          <w:ilvl w:val="0"/>
-          <w:numId w:val="1020"/>
-        </w:numPr>
-      </w:pPr>
-      <w:r>
-        <w:rPr>
-          <w:rFonts w:hint="eastAsia"/>
-        </w:rPr>
-        <w:t xml:space="preserve">高德地图开放平台（高德软件有限公司）—</w:t>
+        <w:t xml:space="preserve">系统与框架类（不涉及个人信息外传）</w:t>
+      </w:r>
+    </w:p>
+    <w:p>
+      <w:pPr>
+        <w:numPr>
+          <w:ilvl w:val="0"/>
+          <w:numId w:val="1022"/>
+        </w:numPr>
+      </w:pPr>
+      <w:r>
+        <w:t xml:space="preserve">Expo </w:t>
+      </w:r>
+      <w:r>
+        <w:rPr>
+          <w:rFonts w:hint="eastAsia"/>
+        </w:rPr>
+        <w:t xml:space="preserve">运行时（Expo,</w:t>
       </w:r>
       <w:r>
         <w:t xml:space="preserve"> </w:t>
@@ -2491,7 +2603,7 @@
         <w:rPr>
           <w:rFonts w:hint="eastAsia"/>
         </w:rPr>
-        <w:t xml:space="preserve">用途：地址解析、POI</w:t>
+        <w:t xml:space="preserve">Inc.）—</w:t>
       </w:r>
       <w:r>
         <w:t xml:space="preserve"> </w:t>
@@ -2500,42 +2612,7 @@
         <w:rPr>
           <w:rFonts w:hint="eastAsia"/>
         </w:rPr>
-        <w:t xml:space="preserve">搜索、地图展示；共享字段：经纬度、地址文本；隐私政策：https://lbs.amap.com/pages/privacy/</w:t>
-      </w:r>
-    </w:p>
-    <w:p>
-      <w:pPr>
-        <w:pStyle w:val="BlockText"/>
-      </w:pPr>
-      <w:r>
-        <w:rPr>
-          <w:rFonts w:hint="eastAsia"/>
-        </w:rPr>
-        <w:t xml:space="preserve">语音与</w:t>
-      </w:r>
-      <w:r>
-        <w:t xml:space="preserve"> AI </w:t>
-      </w:r>
-      <w:r>
-        <w:rPr>
-          <w:rFonts w:hint="eastAsia"/>
-        </w:rPr>
-        <w:t xml:space="preserve">类</w:t>
-      </w:r>
-    </w:p>
-    <w:p>
-      <w:pPr>
-        <w:pStyle w:val="Compact"/>
-        <w:numPr>
-          <w:ilvl w:val="0"/>
-          <w:numId w:val="1021"/>
-        </w:numPr>
-      </w:pPr>
-      <w:r>
-        <w:rPr>
-          <w:rFonts w:hint="eastAsia"/>
-        </w:rPr>
-        <w:t xml:space="preserve">大语言模型服务（供应商待定）—</w:t>
+        <w:t xml:space="preserve">用途：App</w:t>
       </w:r>
       <w:r>
         <w:t xml:space="preserve"> </w:t>
@@ -2544,7 +2621,33 @@
         <w:rPr>
           <w:rFonts w:hint="eastAsia"/>
         </w:rPr>
-        <w:t xml:space="preserve">用途：AI</w:t>
+        <w:t xml:space="preserve">运行框架；隐私政策：https://expo.dev/privacy</w:t>
+      </w:r>
+    </w:p>
+    <w:p>
+      <w:pPr>
+        <w:numPr>
+          <w:ilvl w:val="0"/>
+          <w:numId w:val="1022"/>
+        </w:numPr>
+      </w:pPr>
+      <w:r>
+        <w:t xml:space="preserve">React </w:t>
+      </w:r>
+      <w:r>
+        <w:rPr>
+          <w:rFonts w:hint="eastAsia"/>
+        </w:rPr>
+        <w:t xml:space="preserve">Native（Meta</w:t>
+      </w:r>
+      <w:r>
+        <w:t xml:space="preserve"> Platforms, </w:t>
+      </w:r>
+      <w:r>
+        <w:rPr>
+          <w:rFonts w:hint="eastAsia"/>
+        </w:rPr>
+        <w:t xml:space="preserve">Inc.）—</w:t>
       </w:r>
       <w:r>
         <w:t xml:space="preserve"> </w:t>
@@ -2553,18 +2656,7 @@
         <w:rPr>
           <w:rFonts w:hint="eastAsia"/>
         </w:rPr>
-        <w:t xml:space="preserve">客服、意图识别、智能搜索；共享字段：脱敏后的文本对话</w:t>
-      </w:r>
-    </w:p>
-    <w:p>
-      <w:pPr>
-        <w:pStyle w:val="BlockText"/>
-      </w:pPr>
-      <w:r>
-        <w:rPr>
-          <w:rFonts w:hint="eastAsia"/>
-        </w:rPr>
-        <w:t xml:space="preserve">物流类</w:t>
+        <w:t xml:space="preserve">用途：跨平台框架</w:t>
       </w:r>
     </w:p>
     <w:p>
@@ -2572,151 +2664,6 @@
         <w:numPr>
           <w:ilvl w:val="0"/>
           <w:numId w:val="1022"/>
-        </w:numPr>
-      </w:pPr>
-      <w:r>
-        <w:rPr>
-          <w:rFonts w:hint="eastAsia"/>
-        </w:rPr>
-        <w:t xml:space="preserve">顺丰开放平台（顺丰速运有限公司）—</w:t>
-      </w:r>
-      <w:r>
-        <w:t xml:space="preserve"> </w:t>
-      </w:r>
-      <w:r>
-        <w:rPr>
-          <w:rFonts w:hint="eastAsia"/>
-        </w:rPr>
-        <w:t xml:space="preserve">用途：物流下单、运单查询；共享字段：收件人姓名、脱敏手机号、地址</w:t>
-      </w:r>
-    </w:p>
-    <w:p>
-      <w:pPr>
-        <w:numPr>
-          <w:ilvl w:val="0"/>
-          <w:numId w:val="1022"/>
-        </w:numPr>
-      </w:pPr>
-      <w:r>
-        <w:rPr>
-          <w:rFonts w:hint="eastAsia"/>
-        </w:rPr>
-        <w:t xml:space="preserve">快递</w:t>
-      </w:r>
-      <w:r>
-        <w:t xml:space="preserve"> </w:t>
-      </w:r>
-      <w:r>
-        <w:rPr>
-          <w:rFonts w:hint="eastAsia"/>
-        </w:rPr>
-        <w:t xml:space="preserve">100（深圳市快递壹佰网络科技有限公司）—</w:t>
-      </w:r>
-      <w:r>
-        <w:t xml:space="preserve"> </w:t>
-      </w:r>
-      <w:r>
-        <w:rPr>
-          <w:rFonts w:hint="eastAsia"/>
-        </w:rPr>
-        <w:t xml:space="preserve">用途：物流轨迹查询；共享字段：运单号</w:t>
-      </w:r>
-    </w:p>
-    <w:p>
-      <w:pPr>
-        <w:pStyle w:val="BlockText"/>
-      </w:pPr>
-      <w:r>
-        <w:rPr>
-          <w:rFonts w:hint="eastAsia"/>
-        </w:rPr>
-        <w:t xml:space="preserve">系统与框架类（不涉及个人信息外传）</w:t>
-      </w:r>
-    </w:p>
-    <w:p>
-      <w:pPr>
-        <w:numPr>
-          <w:ilvl w:val="0"/>
-          <w:numId w:val="1023"/>
-        </w:numPr>
-      </w:pPr>
-      <w:r>
-        <w:t xml:space="preserve">Expo </w:t>
-      </w:r>
-      <w:r>
-        <w:rPr>
-          <w:rFonts w:hint="eastAsia"/>
-        </w:rPr>
-        <w:t xml:space="preserve">运行时（Expo,</w:t>
-      </w:r>
-      <w:r>
-        <w:t xml:space="preserve"> </w:t>
-      </w:r>
-      <w:r>
-        <w:rPr>
-          <w:rFonts w:hint="eastAsia"/>
-        </w:rPr>
-        <w:t xml:space="preserve">Inc.）—</w:t>
-      </w:r>
-      <w:r>
-        <w:t xml:space="preserve"> </w:t>
-      </w:r>
-      <w:r>
-        <w:rPr>
-          <w:rFonts w:hint="eastAsia"/>
-        </w:rPr>
-        <w:t xml:space="preserve">用途：App</w:t>
-      </w:r>
-      <w:r>
-        <w:t xml:space="preserve"> </w:t>
-      </w:r>
-      <w:r>
-        <w:rPr>
-          <w:rFonts w:hint="eastAsia"/>
-        </w:rPr>
-        <w:t xml:space="preserve">运行框架；隐私政策：https://expo.dev/privacy</w:t>
-      </w:r>
-    </w:p>
-    <w:p>
-      <w:pPr>
-        <w:numPr>
-          <w:ilvl w:val="0"/>
-          <w:numId w:val="1023"/>
-        </w:numPr>
-      </w:pPr>
-      <w:r>
-        <w:t xml:space="preserve">React </w:t>
-      </w:r>
-      <w:r>
-        <w:rPr>
-          <w:rFonts w:hint="eastAsia"/>
-        </w:rPr>
-        <w:t xml:space="preserve">Native（Meta</w:t>
-      </w:r>
-      <w:r>
-        <w:t xml:space="preserve"> Platforms, </w:t>
-      </w:r>
-      <w:r>
-        <w:rPr>
-          <w:rFonts w:hint="eastAsia"/>
-        </w:rPr>
-        <w:t xml:space="preserve">Inc.）—</w:t>
-      </w:r>
-      <w:r>
-        <w:t xml:space="preserve"> </w:t>
-      </w:r>
-      <w:r>
-        <w:rPr>
-          <w:rFonts w:hint="eastAsia"/>
-        </w:rPr>
-        <w:t xml:space="preserve">用途：跨平台框架</w:t>
-      </w:r>
-    </w:p>
-    <w:p>
-      <w:pPr>
-        <w:numPr>
-          <w:ilvl w:val="0"/>
-          <w:numId w:val="1023"/>
         </w:numPr>
       </w:pPr>
       <w:r>
@@ -2877,7 +2824,7 @@
         <w:pStyle w:val="Compact"/>
         <w:numPr>
           <w:ilvl w:val="0"/>
-          <w:numId w:val="1024"/>
+          <w:numId w:val="1023"/>
         </w:numPr>
       </w:pPr>
       <w:r>
@@ -2901,7 +2848,7 @@
         <w:pStyle w:val="Compact"/>
         <w:numPr>
           <w:ilvl w:val="0"/>
-          <w:numId w:val="1024"/>
+          <w:numId w:val="1023"/>
         </w:numPr>
       </w:pPr>
       <w:r>
@@ -3103,7 +3050,7 @@
       <w:pPr>
         <w:numPr>
           <w:ilvl w:val="0"/>
-          <w:numId w:val="1025"/>
+          <w:numId w:val="1024"/>
         </w:numPr>
       </w:pPr>
       <w:r>
@@ -3117,7 +3064,7 @@
       <w:pPr>
         <w:numPr>
           <w:ilvl w:val="0"/>
-          <w:numId w:val="1025"/>
+          <w:numId w:val="1024"/>
         </w:numPr>
       </w:pPr>
       <w:r>
@@ -3131,7 +3078,7 @@
       <w:pPr>
         <w:numPr>
           <w:ilvl w:val="0"/>
-          <w:numId w:val="1025"/>
+          <w:numId w:val="1024"/>
         </w:numPr>
       </w:pPr>
       <w:r>
@@ -3145,7 +3092,7 @@
       <w:pPr>
         <w:numPr>
           <w:ilvl w:val="0"/>
-          <w:numId w:val="1025"/>
+          <w:numId w:val="1024"/>
         </w:numPr>
       </w:pPr>
       <w:r>
@@ -3159,7 +3106,7 @@
       <w:pPr>
         <w:numPr>
           <w:ilvl w:val="0"/>
-          <w:numId w:val="1025"/>
+          <w:numId w:val="1024"/>
         </w:numPr>
       </w:pPr>
       <w:r>
@@ -3228,7 +3175,7 @@
       <w:pPr>
         <w:numPr>
           <w:ilvl w:val="0"/>
-          <w:numId w:val="1026"/>
+          <w:numId w:val="1025"/>
         </w:numPr>
       </w:pPr>
       <w:r>
@@ -3242,7 +3189,7 @@
       <w:pPr>
         <w:numPr>
           <w:ilvl w:val="0"/>
-          <w:numId w:val="1026"/>
+          <w:numId w:val="1025"/>
         </w:numPr>
       </w:pPr>
       <w:r>
@@ -3256,7 +3203,7 @@
       <w:pPr>
         <w:numPr>
           <w:ilvl w:val="0"/>
-          <w:numId w:val="1026"/>
+          <w:numId w:val="1025"/>
         </w:numPr>
       </w:pPr>
       <w:r>
@@ -3270,7 +3217,7 @@
       <w:pPr>
         <w:numPr>
           <w:ilvl w:val="0"/>
-          <w:numId w:val="1026"/>
+          <w:numId w:val="1025"/>
         </w:numPr>
       </w:pPr>
       <w:r>
@@ -3284,7 +3231,7 @@
       <w:pPr>
         <w:numPr>
           <w:ilvl w:val="0"/>
-          <w:numId w:val="1026"/>
+          <w:numId w:val="1025"/>
         </w:numPr>
       </w:pPr>
       <w:r>
@@ -3298,7 +3245,7 @@
       <w:pPr>
         <w:numPr>
           <w:ilvl w:val="0"/>
-          <w:numId w:val="1026"/>
+          <w:numId w:val="1025"/>
         </w:numPr>
       </w:pPr>
       <w:r>
@@ -4383,9 +4330,6 @@
     <w:abstractNumId w:val="991"/>
   </w:num>
   <w:num w:numId="1025">
-    <w:abstractNumId w:val="991"/>
-  </w:num>
-  <w:num w:numId="1026">
     <w:abstractNumId w:val="991"/>
   </w:num>
 </w:numbering>

</xml_diff>

<commit_message>
docs(digital-asset): sync v2 rules documentation
</commit_message>
<xml_diff>
--- a/docs/legal/爱买买法律文本审核稿.docx
+++ b/docs/legal/爱买买法律文本审核稿.docx
@@ -98,6 +98,21 @@
         <w:t xml:space="preserve">src/content/legal/termsOfService.ts</w:t>
       </w:r>
       <w:r>
+        <w:t xml:space="preserve"> </w:t>
+      </w:r>
+      <w:r>
+        <w:t xml:space="preserve">/</w:t>
+      </w:r>
+      <w:r>
+        <w:t xml:space="preserve"> </w:t>
+      </w:r>
+      <w:r>
+        <w:rPr>
+          <w:rStyle w:val="VerbatimChar"/>
+        </w:rPr>
+        <w:t xml:space="preserve">src/content/legal/memberServiceAgreement.ts</w:t>
+      </w:r>
+      <w:r>
         <w:rPr>
           <w:rFonts w:hint="eastAsia"/>
         </w:rPr>
@@ -162,7 +177,16 @@
         <w:rPr>
           <w:rFonts w:hint="eastAsia"/>
         </w:rPr>
-        <w:t xml:space="preserve">消费积分相关条款是否合规；③</w:t>
+        <w:t xml:space="preserve">消费积分</w:t>
+      </w:r>
+      <w:r>
+        <w:t xml:space="preserve"> / </w:t>
+      </w:r>
+      <w:r>
+        <w:rPr>
+          <w:rFonts w:hint="eastAsia"/>
+        </w:rPr>
+        <w:t xml:space="preserve">数字资产相关条款是否合规；③</w:t>
       </w:r>
       <w:r>
         <w:t xml:space="preserve"> </w:t>
@@ -180,7 +204,16 @@
         <w:rPr>
           <w:rFonts w:hint="eastAsia"/>
         </w:rPr>
-        <w:t xml:space="preserve">第三方信息共享清单（支付/物流/短信等）。</w:t>
+        <w:t xml:space="preserve">第三方信息共享清单（支付/物流/短信等）；⑤</w:t>
+      </w:r>
+      <w:r>
+        <w:t xml:space="preserve"> VIP </w:t>
+      </w:r>
+      <w:r>
+        <w:rPr>
+          <w:rFonts w:hint="eastAsia"/>
+        </w:rPr>
+        <w:t xml:space="preserve">会员服务协议中的数字资产边界与退款限制。</w:t>
       </w:r>
     </w:p>
     <w:bookmarkEnd w:id="9"/>
@@ -416,7 +449,7 @@
         <w:rPr>
           <w:rFonts w:hint="eastAsia"/>
         </w:rPr>
-        <w:t xml:space="preserve">智能选购、商品浏览、交易下单、支付结算、订单履约、售后维权、消费积分获取与使用、推广奖励活动、消息推送、客服咨询、设备权限调用等全流程服务场景。</w:t>
+        <w:t xml:space="preserve">智能选购、商品浏览、交易下单、支付结算、订单履约、售后维权、消费积分获取与使用、数字资产记录与展示、推广奖励活动、消息推送、客服咨询、设备权限调用等全流程服务场景。</w:t>
       </w:r>
     </w:p>
     <w:p>
@@ -532,7 +565,7 @@
         <w:rPr>
           <w:rFonts w:hint="eastAsia"/>
         </w:rPr>
-        <w:t xml:space="preserve">（2）交易履约信息：用户下单记录、选购商品信息、支付订单信息、收货地址、联系人、联系电话、售后维权记录、积分变动记录、推广奖励记录。用于完成电商交易履约、订单售后处理、交易溯源、消费积分核算、推广奖励统计发放，依据《电子商务法》要求，交易及权益相关数据留存不少于</w:t>
+        <w:t xml:space="preserve">（2）交易履约信息：用户下单记录、选购商品信息、支付订单信息、收货地址、联系人、联系电话、售后维权记录、积分变动记录、数字资产账户与流水记录、推广奖励记录。用于完成电商交易履约、订单售后处理、交易溯源、消费积分核算、数字资产记账与展示、推广奖励统计发放，依据《电子商务法》要求，交易及权益相关数据留存不少于</w:t>
       </w:r>
       <w:r>
         <w:t xml:space="preserve"> 3 </w:t>
@@ -844,7 +877,7 @@
         <w:rPr>
           <w:rFonts w:hint="eastAsia"/>
         </w:rPr>
-        <w:t xml:space="preserve">（4）统计用户消费、推广行为，合规核算积分、奖励权益，优化产品及活动规则；</w:t>
+        <w:t xml:space="preserve">（4）统计用户消费、推广行为，合规核算积分、数字资产、奖励权益，优化产品及活动规则；</w:t>
       </w:r>
     </w:p>
     <w:p>
@@ -862,7 +895,7 @@
       </w:r>
     </w:p>
     <w:bookmarkEnd w:id="12"/>
-    <w:bookmarkStart w:id="13" w:name="三推广奖励与消费积分专项合规条款"/>
+    <w:bookmarkStart w:id="13" w:name="三推广奖励消费积分与数字资产专项合规条款"/>
     <w:p>
       <w:pPr>
         <w:pStyle w:val="Heading2"/>
@@ -871,7 +904,7 @@
         <w:rPr>
           <w:rFonts w:hint="eastAsia"/>
         </w:rPr>
-        <w:t xml:space="preserve">三、推广奖励与消费积分专项合规条款</w:t>
+        <w:t xml:space="preserve">三、推广奖励、消费积分与数字资产专项合规条款</w:t>
       </w:r>
     </w:p>
     <w:p>
@@ -891,7 +924,7 @@
         <w:rPr>
           <w:rFonts w:hint="eastAsia"/>
         </w:rPr>
-        <w:t xml:space="preserve">消费积分、用户推广奖励活动严格遵循《规范促销行为暂行规定》《电子商务法》相关要求，坚持自愿参与、规则透明、数据合规、无金融风险原则，所有权益相关数据处理全程合规。</w:t>
+        <w:t xml:space="preserve">消费积分、数字资产、用户推广奖励活动严格遵循《规范促销行为暂行规定》《电子商务法》相关要求，坚持自愿参与、规则透明、数据合规、无金融风险原则，所有权益相关数据处理全程合规。</w:t>
       </w:r>
     </w:p>
     <w:p>
@@ -1014,6 +1047,143 @@
         <w:rPr>
           <w:rFonts w:hint="eastAsia"/>
         </w:rPr>
+        <w:t xml:space="preserve">数字资产规则与处理口径</w:t>
+      </w:r>
+    </w:p>
+    <w:p>
+      <w:pPr>
+        <w:pStyle w:val="FirstParagraph"/>
+      </w:pPr>
+      <w:r>
+        <w:rPr>
+          <w:rFonts w:hint="eastAsia"/>
+          <w:b/>
+          <w:bCs/>
+        </w:rPr>
+        <w:t xml:space="preserve">（1）数字资产性质：数字资产包括种子资产和信用资产，仅为平台根据公示规则在用户账号内记录和展示的数字化权益，不是现金、储值余额、存款、证券、股权份额或可流通代币，不承诺固定收益、保本增值、现金兑换、股权/期权/工资折算或其他回报。数字资产不可在用户之间转让、交易、赠送、倒卖或转售。</w:t>
+      </w:r>
+    </w:p>
+    <w:p>
+      <w:pPr>
+        <w:numPr>
+          <w:ilvl w:val="0"/>
+          <w:numId w:val="1006"/>
+        </w:numPr>
+      </w:pPr>
+      <w:r>
+        <w:rPr>
+          <w:rFonts w:hint="eastAsia"/>
+        </w:rPr>
+        <w:t xml:space="preserve">（2）展示范围：仅</w:t>
+      </w:r>
+      <w:r>
+        <w:t xml:space="preserve"> VIP </w:t>
+      </w:r>
+      <w:r>
+        <w:rPr>
+          <w:rFonts w:hint="eastAsia"/>
+        </w:rPr>
+        <w:t xml:space="preserve">用户拥有并展示数字资产余额；普通用户仅记录累计消费金额，并可查看</w:t>
+      </w:r>
+      <w:r>
+        <w:t xml:space="preserve"> VIP </w:t>
+      </w:r>
+      <w:r>
+        <w:rPr>
+          <w:rFonts w:hint="eastAsia"/>
+        </w:rPr>
+        <w:t xml:space="preserve">激活引导。为此，我们会处理用户的会员层级状态、累计消费金额、数字资产账户余额、数字资产流水和相关规则快照，用于页面展示、后台对账、客服排查和审计留痕。</w:t>
+      </w:r>
+    </w:p>
+    <w:p>
+      <w:pPr>
+        <w:numPr>
+          <w:ilvl w:val="0"/>
+          <w:numId w:val="1006"/>
+        </w:numPr>
+      </w:pPr>
+      <w:r>
+        <w:rPr>
+          <w:rFonts w:hint="eastAsia"/>
+        </w:rPr>
+        <w:t xml:space="preserve">（3）累计消费与入账口径：累计消费金额适用于所有用户，仅按普通商品实付商品金额计算，不含运费、平台红包抵扣、消费积分抵扣及</w:t>
+      </w:r>
+      <w:r>
+        <w:t xml:space="preserve"> VIP </w:t>
+      </w:r>
+      <w:r>
+        <w:rPr>
+          <w:rFonts w:hint="eastAsia"/>
+        </w:rPr>
+        <w:t xml:space="preserve">折扣；VIP</w:t>
+      </w:r>
+      <w:r>
+        <w:t xml:space="preserve"> </w:t>
+      </w:r>
+      <w:r>
+        <w:rPr>
+          <w:rFonts w:hint="eastAsia"/>
+        </w:rPr>
+        <w:t xml:space="preserve">礼包订单不计入累计消费金额，也不直接产生信用资产。种子资产仅来源于本人购买</w:t>
+      </w:r>
+      <w:r>
+        <w:t xml:space="preserve"> VIP </w:t>
+      </w:r>
+      <w:r>
+        <w:rPr>
+          <w:rFonts w:hint="eastAsia"/>
+        </w:rPr>
+        <w:t xml:space="preserve">礼包及其直接邀请好友购买</w:t>
+      </w:r>
+      <w:r>
+        <w:t xml:space="preserve"> VIP </w:t>
+      </w:r>
+      <w:r>
+        <w:rPr>
+          <w:rFonts w:hint="eastAsia"/>
+        </w:rPr>
+        <w:t xml:space="preserve">礼包两类场景，且仅发放给本人或直接邀请人；信用资产按平台可配置的累计消费倍率档位计算。平台配置修改通常仅影响后续行为，已形成的历史流水以入账时保存的规则快照、订单信息和台账记录解释。</w:t>
+      </w:r>
+    </w:p>
+    <w:p>
+      <w:pPr>
+        <w:numPr>
+          <w:ilvl w:val="0"/>
+          <w:numId w:val="1006"/>
+        </w:numPr>
+      </w:pPr>
+      <w:r>
+        <w:rPr>
+          <w:rFonts w:hint="eastAsia"/>
+        </w:rPr>
+        <w:t xml:space="preserve">（4）未来用途：数字资产未来是否开放使用、兑换、折现、收益、权益转换等功能尚未确定。除平台后续正式公示规则外，我们不会将数字资产数据用于向您承诺固定现金价值、股权比例、收益回报或其他未公布权益。</w:t>
+      </w:r>
+    </w:p>
+    <w:p>
+      <w:pPr>
+        <w:numPr>
+          <w:ilvl w:val="0"/>
+          <w:numId w:val="1006"/>
+        </w:numPr>
+      </w:pPr>
+      <w:r>
+        <w:rPr>
+          <w:rFonts w:hint="eastAsia"/>
+        </w:rPr>
+        <w:t xml:space="preserve">（5）失效与留存：用户注销账号、严重违规封禁、平台依法依规处置或法律法规要求的其他情形下，数字资产将按平台规则清零作废或终止展示；相关必要流水、规则快照和审计台账仍会按法定期限留存，用于交易溯源、合规审计和争议处理。</w:t>
+      </w:r>
+    </w:p>
+    <w:p>
+      <w:pPr>
+        <w:pStyle w:val="BlockText"/>
+      </w:pPr>
+      <w:r>
+        <w:t xml:space="preserve">3.3 </w:t>
+      </w:r>
+      <w:r>
+        <w:rPr>
+          <w:rFonts w:hint="eastAsia"/>
+        </w:rPr>
         <w:t xml:space="preserve">推广奖励合规规则</w:t>
       </w:r>
     </w:p>
@@ -1021,7 +1191,7 @@
       <w:pPr>
         <w:numPr>
           <w:ilvl w:val="0"/>
-          <w:numId w:val="1006"/>
+          <w:numId w:val="1007"/>
         </w:numPr>
       </w:pPr>
       <w:r>
@@ -1035,7 +1205,7 @@
       <w:pPr>
         <w:numPr>
           <w:ilvl w:val="0"/>
-          <w:numId w:val="1006"/>
+          <w:numId w:val="1007"/>
         </w:numPr>
       </w:pPr>
       <w:r>
@@ -1063,7 +1233,7 @@
         <w:pStyle w:val="Compact"/>
         <w:numPr>
           <w:ilvl w:val="0"/>
-          <w:numId w:val="1007"/>
+          <w:numId w:val="1008"/>
         </w:numPr>
       </w:pPr>
       <w:r>
@@ -1140,7 +1310,7 @@
       <w:pPr>
         <w:numPr>
           <w:ilvl w:val="0"/>
-          <w:numId w:val="1008"/>
+          <w:numId w:val="1009"/>
         </w:numPr>
       </w:pPr>
       <w:r>
@@ -1154,14 +1324,14 @@
       <w:pPr>
         <w:numPr>
           <w:ilvl w:val="0"/>
-          <w:numId w:val="1008"/>
-        </w:numPr>
-      </w:pPr>
-      <w:r>
-        <w:rPr>
-          <w:rFonts w:hint="eastAsia"/>
-        </w:rPr>
-        <w:t xml:space="preserve">（2）交易、积分、推广权益数据：依据《电子商务法》规定，留存期限不少于</w:t>
+          <w:numId w:val="1009"/>
+        </w:numPr>
+      </w:pPr>
+      <w:r>
+        <w:rPr>
+          <w:rFonts w:hint="eastAsia"/>
+        </w:rPr>
+        <w:t xml:space="preserve">（2）交易、积分、数字资产、推广权益数据：依据《电子商务法》规定，留存期限不少于</w:t>
       </w:r>
       <w:r>
         <w:t xml:space="preserve"> 3 </w:t>
@@ -1177,7 +1347,7 @@
       <w:pPr>
         <w:numPr>
           <w:ilvl w:val="0"/>
-          <w:numId w:val="1008"/>
+          <w:numId w:val="1009"/>
         </w:numPr>
       </w:pPr>
       <w:r>
@@ -1200,7 +1370,7 @@
       <w:pPr>
         <w:numPr>
           <w:ilvl w:val="0"/>
-          <w:numId w:val="1008"/>
+          <w:numId w:val="1009"/>
         </w:numPr>
       </w:pPr>
       <w:r>
@@ -1228,7 +1398,7 @@
       <w:pPr>
         <w:numPr>
           <w:ilvl w:val="0"/>
-          <w:numId w:val="1009"/>
+          <w:numId w:val="1010"/>
         </w:numPr>
       </w:pPr>
       <w:r>
@@ -1251,7 +1421,7 @@
       <w:pPr>
         <w:numPr>
           <w:ilvl w:val="0"/>
-          <w:numId w:val="1009"/>
+          <w:numId w:val="1010"/>
         </w:numPr>
       </w:pPr>
       <w:r>
@@ -1265,7 +1435,7 @@
       <w:pPr>
         <w:numPr>
           <w:ilvl w:val="0"/>
-          <w:numId w:val="1009"/>
+          <w:numId w:val="1010"/>
         </w:numPr>
       </w:pPr>
       <w:r>
@@ -1288,7 +1458,7 @@
       <w:pPr>
         <w:numPr>
           <w:ilvl w:val="0"/>
-          <w:numId w:val="1009"/>
+          <w:numId w:val="1010"/>
         </w:numPr>
       </w:pPr>
       <w:r>
@@ -1335,7 +1505,7 @@
           <w:b/>
           <w:bCs/>
         </w:rPr>
-        <w:t xml:space="preserve">（5）虚拟资产即时清零作废（含钱包可提现余额）：提交注销的瞬间，您账号下的消费积分、分润奖励（含待发放/冻结中/可提现部分）、平台红包与优惠券、VIP</w:t>
+        <w:t xml:space="preserve">（5）虚拟资产即时清零作废（含钱包可提现余额）：提交注销的瞬间，您账号下的消费积分、数字资产（含种子资产、信用资产）、分润奖励（含待发放/冻结中/可提现部分）、平台红包与优惠券、VIP</w:t>
       </w:r>
       <w:r>
         <w:rPr>
@@ -1357,7 +1527,7 @@
       <w:pPr>
         <w:numPr>
           <w:ilvl w:val="0"/>
-          <w:numId w:val="1010"/>
+          <w:numId w:val="1011"/>
         </w:numPr>
       </w:pPr>
       <w:r>
@@ -1380,7 +1550,7 @@
       <w:pPr>
         <w:numPr>
           <w:ilvl w:val="0"/>
-          <w:numId w:val="1010"/>
+          <w:numId w:val="1011"/>
         </w:numPr>
       </w:pPr>
       <w:r>
@@ -1441,7 +1611,7 @@
       <w:pPr>
         <w:numPr>
           <w:ilvl w:val="0"/>
-          <w:numId w:val="1011"/>
+          <w:numId w:val="1012"/>
         </w:numPr>
       </w:pPr>
       <w:r>
@@ -1455,7 +1625,7 @@
       <w:pPr>
         <w:numPr>
           <w:ilvl w:val="0"/>
-          <w:numId w:val="1011"/>
+          <w:numId w:val="1012"/>
         </w:numPr>
       </w:pPr>
       <w:r>
@@ -1469,7 +1639,7 @@
       <w:pPr>
         <w:numPr>
           <w:ilvl w:val="0"/>
-          <w:numId w:val="1011"/>
+          <w:numId w:val="1012"/>
         </w:numPr>
       </w:pPr>
       <w:r>
@@ -1483,7 +1653,7 @@
       <w:pPr>
         <w:numPr>
           <w:ilvl w:val="0"/>
-          <w:numId w:val="1011"/>
+          <w:numId w:val="1012"/>
         </w:numPr>
       </w:pPr>
       <w:r>
@@ -1636,7 +1806,7 @@
       <w:pPr>
         <w:numPr>
           <w:ilvl w:val="0"/>
-          <w:numId w:val="1012"/>
+          <w:numId w:val="1013"/>
         </w:numPr>
       </w:pPr>
       <w:r>
@@ -1662,7 +1832,7 @@
       <w:pPr>
         <w:numPr>
           <w:ilvl w:val="0"/>
-          <w:numId w:val="1012"/>
+          <w:numId w:val="1013"/>
         </w:numPr>
       </w:pPr>
       <w:r>
@@ -1679,7 +1849,7 @@
       <w:pPr>
         <w:numPr>
           <w:ilvl w:val="0"/>
-          <w:numId w:val="1012"/>
+          <w:numId w:val="1013"/>
         </w:numPr>
       </w:pPr>
       <w:r>
@@ -1696,7 +1866,7 @@
       <w:pPr>
         <w:numPr>
           <w:ilvl w:val="0"/>
-          <w:numId w:val="1012"/>
+          <w:numId w:val="1013"/>
         </w:numPr>
       </w:pPr>
       <w:r>
@@ -1746,7 +1916,7 @@
       <w:pPr>
         <w:numPr>
           <w:ilvl w:val="0"/>
-          <w:numId w:val="1013"/>
+          <w:numId w:val="1014"/>
         </w:numPr>
       </w:pPr>
       <w:r>
@@ -1763,7 +1933,7 @@
       <w:pPr>
         <w:numPr>
           <w:ilvl w:val="0"/>
-          <w:numId w:val="1013"/>
+          <w:numId w:val="1014"/>
         </w:numPr>
       </w:pPr>
       <w:r>
@@ -1780,7 +1950,7 @@
       <w:pPr>
         <w:numPr>
           <w:ilvl w:val="0"/>
-          <w:numId w:val="1013"/>
+          <w:numId w:val="1014"/>
         </w:numPr>
       </w:pPr>
       <w:r>
@@ -1910,7 +2080,7 @@
       <w:pPr>
         <w:numPr>
           <w:ilvl w:val="0"/>
-          <w:numId w:val="1014"/>
+          <w:numId w:val="1015"/>
         </w:numPr>
       </w:pPr>
       <w:r>
@@ -1924,7 +2094,7 @@
       <w:pPr>
         <w:numPr>
           <w:ilvl w:val="0"/>
-          <w:numId w:val="1014"/>
+          <w:numId w:val="1015"/>
         </w:numPr>
       </w:pPr>
       <w:r>
@@ -1938,7 +2108,7 @@
       <w:pPr>
         <w:numPr>
           <w:ilvl w:val="0"/>
-          <w:numId w:val="1014"/>
+          <w:numId w:val="1015"/>
         </w:numPr>
       </w:pPr>
       <w:r>
@@ -1992,7 +2162,7 @@
       <w:pPr>
         <w:numPr>
           <w:ilvl w:val="0"/>
-          <w:numId w:val="1015"/>
+          <w:numId w:val="1016"/>
         </w:numPr>
       </w:pPr>
       <w:r>
@@ -2015,7 +2185,7 @@
       <w:pPr>
         <w:numPr>
           <w:ilvl w:val="0"/>
-          <w:numId w:val="1015"/>
+          <w:numId w:val="1016"/>
         </w:numPr>
       </w:pPr>
       <w:r>
@@ -2029,7 +2199,7 @@
       <w:pPr>
         <w:numPr>
           <w:ilvl w:val="0"/>
-          <w:numId w:val="1015"/>
+          <w:numId w:val="1016"/>
         </w:numPr>
       </w:pPr>
       <w:r>
@@ -2173,7 +2343,7 @@
       <w:pPr>
         <w:numPr>
           <w:ilvl w:val="0"/>
-          <w:numId w:val="1016"/>
+          <w:numId w:val="1017"/>
         </w:numPr>
       </w:pPr>
       <w:r>
@@ -2196,7 +2366,7 @@
       <w:pPr>
         <w:numPr>
           <w:ilvl w:val="0"/>
-          <w:numId w:val="1016"/>
+          <w:numId w:val="1017"/>
         </w:numPr>
       </w:pPr>
       <w:r>
@@ -2240,7 +2410,7 @@
         <w:pStyle w:val="Compact"/>
         <w:numPr>
           <w:ilvl w:val="0"/>
-          <w:numId w:val="1017"/>
+          <w:numId w:val="1018"/>
         </w:numPr>
       </w:pPr>
       <w:r>
@@ -2274,7 +2444,7 @@
       <w:pPr>
         <w:numPr>
           <w:ilvl w:val="0"/>
-          <w:numId w:val="1018"/>
+          <w:numId w:val="1019"/>
         </w:numPr>
       </w:pPr>
       <w:r>
@@ -2306,7 +2476,7 @@
       <w:pPr>
         <w:numPr>
           <w:ilvl w:val="0"/>
-          <w:numId w:val="1018"/>
+          <w:numId w:val="1019"/>
         </w:numPr>
       </w:pPr>
       <w:r>
@@ -2341,7 +2511,7 @@
         <w:pStyle w:val="Compact"/>
         <w:numPr>
           <w:ilvl w:val="0"/>
-          <w:numId w:val="1019"/>
+          <w:numId w:val="1020"/>
         </w:numPr>
       </w:pPr>
       <w:r>
@@ -2394,7 +2564,7 @@
         <w:pStyle w:val="Compact"/>
         <w:numPr>
           <w:ilvl w:val="0"/>
-          <w:numId w:val="1020"/>
+          <w:numId w:val="1021"/>
         </w:numPr>
       </w:pPr>
       <w:r>
@@ -2437,7 +2607,7 @@
       <w:pPr>
         <w:numPr>
           <w:ilvl w:val="0"/>
-          <w:numId w:val="1021"/>
+          <w:numId w:val="1022"/>
         </w:numPr>
       </w:pPr>
       <w:r>
@@ -2460,7 +2630,7 @@
       <w:pPr>
         <w:numPr>
           <w:ilvl w:val="0"/>
-          <w:numId w:val="1021"/>
+          <w:numId w:val="1022"/>
         </w:numPr>
       </w:pPr>
       <w:r>
@@ -2503,7 +2673,7 @@
       <w:pPr>
         <w:numPr>
           <w:ilvl w:val="0"/>
-          <w:numId w:val="1022"/>
+          <w:numId w:val="1023"/>
         </w:numPr>
       </w:pPr>
       <w:r>
@@ -2547,7 +2717,7 @@
       <w:pPr>
         <w:numPr>
           <w:ilvl w:val="0"/>
-          <w:numId w:val="1022"/>
+          <w:numId w:val="1023"/>
         </w:numPr>
       </w:pPr>
       <w:r>
@@ -2582,7 +2752,7 @@
       <w:pPr>
         <w:numPr>
           <w:ilvl w:val="0"/>
-          <w:numId w:val="1022"/>
+          <w:numId w:val="1023"/>
         </w:numPr>
       </w:pPr>
       <w:r>
@@ -2743,7 +2913,7 @@
         <w:pStyle w:val="Compact"/>
         <w:numPr>
           <w:ilvl w:val="0"/>
-          <w:numId w:val="1023"/>
+          <w:numId w:val="1024"/>
         </w:numPr>
       </w:pPr>
       <w:r>
@@ -2767,7 +2937,7 @@
         <w:pStyle w:val="Compact"/>
         <w:numPr>
           <w:ilvl w:val="0"/>
-          <w:numId w:val="1023"/>
+          <w:numId w:val="1024"/>
         </w:numPr>
       </w:pPr>
       <w:r>
@@ -2833,7 +3003,7 @@
         <w:rPr>
           <w:rFonts w:hint="eastAsia"/>
         </w:rPr>
-        <w:t xml:space="preserve">选购、积分权益、推广活动、售后咨询等服务的自然人用户。</w:t>
+        <w:t xml:space="preserve">选购、消费积分、数字资产展示、推广活动、售后咨询等服务的自然人用户。</w:t>
       </w:r>
     </w:p>
     <w:p>
@@ -2856,7 +3026,7 @@
         <w:rPr>
           <w:rFonts w:hint="eastAsia"/>
         </w:rPr>
-        <w:t xml:space="preserve">智能选购、在线交易、支付履约、物流查询、售后服务、消费积分、用户推广奖励、消息提醒、客服咨询等一站式电商服务。</w:t>
+        <w:t xml:space="preserve">智能选购、在线交易、支付履约、物流查询、售后服务、消费积分、数字资产记录与展示、用户推广奖励、消息提醒、客服咨询等一站式电商服务。</w:t>
       </w:r>
     </w:p>
     <w:p>
@@ -2969,7 +3139,7 @@
       <w:pPr>
         <w:numPr>
           <w:ilvl w:val="0"/>
-          <w:numId w:val="1024"/>
+          <w:numId w:val="1025"/>
         </w:numPr>
       </w:pPr>
       <w:r>
@@ -2983,7 +3153,7 @@
       <w:pPr>
         <w:numPr>
           <w:ilvl w:val="0"/>
-          <w:numId w:val="1024"/>
+          <w:numId w:val="1025"/>
         </w:numPr>
       </w:pPr>
       <w:r>
@@ -2997,7 +3167,7 @@
       <w:pPr>
         <w:numPr>
           <w:ilvl w:val="0"/>
-          <w:numId w:val="1024"/>
+          <w:numId w:val="1025"/>
         </w:numPr>
       </w:pPr>
       <w:r>
@@ -3011,7 +3181,7 @@
       <w:pPr>
         <w:numPr>
           <w:ilvl w:val="0"/>
-          <w:numId w:val="1024"/>
+          <w:numId w:val="1025"/>
         </w:numPr>
       </w:pPr>
       <w:r>
@@ -3025,7 +3195,7 @@
       <w:pPr>
         <w:numPr>
           <w:ilvl w:val="0"/>
-          <w:numId w:val="1024"/>
+          <w:numId w:val="1025"/>
         </w:numPr>
       </w:pPr>
       <w:r>
@@ -3094,7 +3264,7 @@
       <w:pPr>
         <w:numPr>
           <w:ilvl w:val="0"/>
-          <w:numId w:val="1025"/>
+          <w:numId w:val="1026"/>
         </w:numPr>
       </w:pPr>
       <w:r>
@@ -3108,7 +3278,7 @@
       <w:pPr>
         <w:numPr>
           <w:ilvl w:val="0"/>
-          <w:numId w:val="1025"/>
+          <w:numId w:val="1026"/>
         </w:numPr>
       </w:pPr>
       <w:r>
@@ -3122,7 +3292,7 @@
       <w:pPr>
         <w:numPr>
           <w:ilvl w:val="0"/>
-          <w:numId w:val="1025"/>
+          <w:numId w:val="1026"/>
         </w:numPr>
       </w:pPr>
       <w:r>
@@ -3136,7 +3306,7 @@
       <w:pPr>
         <w:numPr>
           <w:ilvl w:val="0"/>
-          <w:numId w:val="1025"/>
+          <w:numId w:val="1026"/>
         </w:numPr>
       </w:pPr>
       <w:r>
@@ -3150,7 +3320,7 @@
       <w:pPr>
         <w:numPr>
           <w:ilvl w:val="0"/>
-          <w:numId w:val="1025"/>
+          <w:numId w:val="1026"/>
         </w:numPr>
       </w:pPr>
       <w:r>
@@ -3164,7 +3334,7 @@
       <w:pPr>
         <w:numPr>
           <w:ilvl w:val="0"/>
-          <w:numId w:val="1025"/>
+          <w:numId w:val="1026"/>
         </w:numPr>
       </w:pPr>
       <w:r>
@@ -3424,6 +3594,108 @@
         <w:t xml:space="preserve">权益最终解释权：在不违反法律法规的前提下，平台对积分规则、推广活动规则、权益使用规则享有最终解释与调整权利，规则调整后将通过平台公告公示，公示后即时生效。</w:t>
       </w:r>
     </w:p>
+    <w:p>
+      <w:pPr>
+        <w:pStyle w:val="BodyText"/>
+      </w:pPr>
+      <w:r>
+        <w:rPr>
+          <w:b/>
+          <w:bCs/>
+        </w:rPr>
+        <w:t xml:space="preserve">5.6 </w:t>
+      </w:r>
+      <w:r>
+        <w:rPr>
+          <w:rFonts w:hint="eastAsia"/>
+          <w:b/>
+          <w:bCs/>
+        </w:rPr>
+        <w:t xml:space="preserve">数字资产边界：本平台数字资产包括种子资产和信用资产，仅为平台根据公示规则在用户账号内记录和展示的数字化权益，不是现金、储值余额、存款、理财、证券、股权份额或可流通代币，不构成对用户的固定收益、保本增值、现金兑换、股权/期权/工资折算或其他回报承诺。数字资产不可转让、不可交易、不可赠送、不可倒卖、不可转售。未来是否开放使用、兑换、折现、权益转换等功能，以平台后续正式公示规则为准；在正式公示前，任何页面展示、宣传或沟通均不视为平台承诺。</w:t>
+      </w:r>
+    </w:p>
+    <w:p>
+      <w:pPr>
+        <w:pStyle w:val="BodyText"/>
+      </w:pPr>
+      <w:r>
+        <w:t xml:space="preserve">5.7 </w:t>
+      </w:r>
+      <w:r>
+        <w:rPr>
+          <w:rFonts w:hint="eastAsia"/>
+        </w:rPr>
+        <w:t xml:space="preserve">数字资产生成与展示规则：仅</w:t>
+      </w:r>
+      <w:r>
+        <w:t xml:space="preserve"> VIP </w:t>
+      </w:r>
+      <w:r>
+        <w:rPr>
+          <w:rFonts w:hint="eastAsia"/>
+        </w:rPr>
+        <w:t xml:space="preserve">用户拥有并展示数字资产余额；普通用户仅记录累计消费金额并可查看</w:t>
+      </w:r>
+      <w:r>
+        <w:t xml:space="preserve"> VIP </w:t>
+      </w:r>
+      <w:r>
+        <w:rPr>
+          <w:rFonts w:hint="eastAsia"/>
+        </w:rPr>
+        <w:t xml:space="preserve">激活引导。累计消费金额适用于所有用户，仅按普通商品实付商品金额计算，不含运费、平台红包抵扣、消费积分抵扣及</w:t>
+      </w:r>
+      <w:r>
+        <w:t xml:space="preserve"> VIP </w:t>
+      </w:r>
+      <w:r>
+        <w:rPr>
+          <w:rFonts w:hint="eastAsia"/>
+        </w:rPr>
+        <w:t xml:space="preserve">折扣；VIP</w:t>
+      </w:r>
+      <w:r>
+        <w:t xml:space="preserve"> </w:t>
+      </w:r>
+      <w:r>
+        <w:rPr>
+          <w:rFonts w:hint="eastAsia"/>
+        </w:rPr>
+        <w:t xml:space="preserve">礼包订单不计入累计消费金额，也不直接产生信用资产。种子资产仅来源于用户本人购买</w:t>
+      </w:r>
+      <w:r>
+        <w:t xml:space="preserve"> VIP </w:t>
+      </w:r>
+      <w:r>
+        <w:rPr>
+          <w:rFonts w:hint="eastAsia"/>
+        </w:rPr>
+        <w:t xml:space="preserve">礼包及其直接邀请好友购买</w:t>
+      </w:r>
+      <w:r>
+        <w:t xml:space="preserve"> VIP </w:t>
+      </w:r>
+      <w:r>
+        <w:rPr>
+          <w:rFonts w:hint="eastAsia"/>
+        </w:rPr>
+        <w:t xml:space="preserve">礼包两类场景，且仅发放给本人或直接邀请人，不向间接上级扩散。信用资产按平台可配置的累计消费倍率档位计算，具体入账数量、来源、快照规则、历史流水解释和后续规则调整，以交易时或入账时保存的平台流水快照及当时公示规则为准；后台修改后的数值通常仅影响后续行为，不当然追溯已经形成的历史流水。</w:t>
+      </w:r>
+    </w:p>
+    <w:p>
+      <w:pPr>
+        <w:pStyle w:val="BodyText"/>
+      </w:pPr>
+      <w:r>
+        <w:t xml:space="preserve">5.8 </w:t>
+      </w:r>
+      <w:r>
+        <w:rPr>
+          <w:rFonts w:hint="eastAsia"/>
+        </w:rPr>
+        <w:t xml:space="preserve">数字资产失效与清退：账号注销、严重违规封禁、平台依法依规处置或法律法规要求的其他情形下，数字资产将依本协议、平台规则及适用法律被清零作废或终止展示，相关必要审计流水和台账按法定期限留存。</w:t>
+      </w:r>
+    </w:p>
     <w:bookmarkEnd w:id="29"/>
     <w:bookmarkStart w:id="30" w:name="六账号注销与权益终止规则"/>
     <w:p>
@@ -3505,7 +3777,7 @@
           <w:b/>
           <w:bCs/>
         </w:rPr>
-        <w:t xml:space="preserve">虚拟资产即时清零作废（含钱包可提现现金）：账号注销提交的瞬间，用户账号下消费积分、分润奖励（含待发放、冻结中及可提现部分）、平台红包与优惠券、VIP</w:t>
+        <w:t xml:space="preserve">虚拟资产即时清零作废（含钱包可提现现金）：账号注销提交的瞬间，用户账号下消费积分、数字资产（含种子资产、信用资产）、分润奖励（含待发放、冻结中及可提现部分）、平台红包与优惠券、VIP</w:t>
       </w:r>
       <w:r>
         <w:rPr>
@@ -3960,6 +4232,824 @@
     </w:p>
     <w:bookmarkEnd w:id="36"/>
     <w:bookmarkEnd w:id="37"/>
+    <w:bookmarkStart w:id="47" w:name="ai爱买买app会员服务协议"/>
+    <w:p>
+      <w:pPr>
+        <w:pStyle w:val="Heading1"/>
+      </w:pPr>
+      <w:r>
+        <w:rPr>
+          <w:rFonts w:hint="eastAsia"/>
+        </w:rPr>
+        <w:t xml:space="preserve">AI爱买买APP会员服务协议</w:t>
+      </w:r>
+    </w:p>
+    <w:p>
+      <w:pPr>
+        <w:pStyle w:val="BlockText"/>
+      </w:pPr>
+      <w:r>
+        <w:rPr>
+          <w:rFonts w:hint="eastAsia"/>
+        </w:rPr>
+        <w:t xml:space="preserve">版本</w:t>
+      </w:r>
+      <w:r>
+        <w:t xml:space="preserve"> v1.0 </w:t>
+      </w:r>
+      <w:r>
+        <w:rPr>
+          <w:rFonts w:hint="eastAsia"/>
+        </w:rPr>
+        <w:t xml:space="preserve">｜</w:t>
+      </w:r>
+      <w:r>
+        <w:t xml:space="preserve"> </w:t>
+      </w:r>
+      <w:r>
+        <w:rPr>
+          <w:rFonts w:hint="eastAsia"/>
+        </w:rPr>
+        <w:t xml:space="preserve">发布日期</w:t>
+      </w:r>
+      <w:r>
+        <w:t xml:space="preserve"> 2026-06-10 </w:t>
+      </w:r>
+      <w:r>
+        <w:rPr>
+          <w:rFonts w:hint="eastAsia"/>
+        </w:rPr>
+        <w:t xml:space="preserve">｜</w:t>
+      </w:r>
+      <w:r>
+        <w:t xml:space="preserve"> </w:t>
+      </w:r>
+      <w:r>
+        <w:rPr>
+          <w:rFonts w:hint="eastAsia"/>
+        </w:rPr>
+        <w:t xml:space="preserve">生效日期</w:t>
+      </w:r>
+      <w:r>
+        <w:t xml:space="preserve"> 2026-06-10</w:t>
+      </w:r>
+    </w:p>
+    <w:bookmarkStart w:id="38" w:name="要点摘要-2"/>
+    <w:p>
+      <w:pPr>
+        <w:pStyle w:val="Heading2"/>
+      </w:pPr>
+      <w:r>
+        <w:rPr>
+          <w:rFonts w:hint="eastAsia"/>
+        </w:rPr>
+        <w:t xml:space="preserve">要点摘要</w:t>
+      </w:r>
+    </w:p>
+    <w:p>
+      <w:pPr>
+        <w:pStyle w:val="Compact"/>
+        <w:numPr>
+          <w:ilvl w:val="0"/>
+          <w:numId w:val="1027"/>
+        </w:numPr>
+      </w:pPr>
+      <w:r>
+        <w:rPr>
+          <w:rFonts w:hint="eastAsia"/>
+        </w:rPr>
+        <w:t xml:space="preserve">本协议适用于您在</w:t>
+      </w:r>
+      <w:r>
+        <w:t xml:space="preserve"> </w:t>
+      </w:r>
+      <w:r>
+        <w:rPr>
+          <w:rFonts w:hint="eastAsia"/>
+        </w:rPr>
+        <w:t xml:space="preserve">AI爱买买APP</w:t>
+      </w:r>
+      <w:r>
+        <w:t xml:space="preserve"> </w:t>
+      </w:r>
+      <w:r>
+        <w:rPr>
+          <w:rFonts w:hint="eastAsia"/>
+        </w:rPr>
+        <w:t xml:space="preserve">内购买、开通和使用</w:t>
+      </w:r>
+      <w:r>
+        <w:t xml:space="preserve"> VIP </w:t>
+      </w:r>
+      <w:r>
+        <w:rPr>
+          <w:rFonts w:hint="eastAsia"/>
+        </w:rPr>
+        <w:t xml:space="preserve">会员服务。请您在开通</w:t>
+      </w:r>
+      <w:r>
+        <w:t xml:space="preserve"> VIP </w:t>
+      </w:r>
+      <w:r>
+        <w:rPr>
+          <w:rFonts w:hint="eastAsia"/>
+        </w:rPr>
+        <w:t xml:space="preserve">前完整阅读并充分理解本协议，特别是会员权益、支付开通、退款限制、推荐奖励、账号注销及违规处理等条款。</w:t>
+      </w:r>
+    </w:p>
+    <w:p>
+      <w:pPr>
+        <w:pStyle w:val="Compact"/>
+        <w:numPr>
+          <w:ilvl w:val="0"/>
+          <w:numId w:val="1027"/>
+        </w:numPr>
+      </w:pPr>
+      <w:r>
+        <w:rPr>
+          <w:rFonts w:hint="eastAsia"/>
+        </w:rPr>
+        <w:t xml:space="preserve">您在会员开通或支付界面勾选同意《会员服务协议》并继续支付，即表示您已阅读、理解并接受本协议全部内容。本协议与《AI爱买买APP用户协议》《AI爱买买APP隐私政策》及页面公示规则共同构成会员服务规则。</w:t>
+      </w:r>
+    </w:p>
+    <w:bookmarkEnd w:id="38"/>
+    <w:bookmarkStart w:id="39" w:name="一定义与适用范围-1"/>
+    <w:p>
+      <w:pPr>
+        <w:pStyle w:val="Heading2"/>
+      </w:pPr>
+      <w:r>
+        <w:rPr>
+          <w:rFonts w:hint="eastAsia"/>
+        </w:rPr>
+        <w:t xml:space="preserve">一、定义与适用范围</w:t>
+      </w:r>
+    </w:p>
+    <w:p>
+      <w:pPr>
+        <w:pStyle w:val="FirstParagraph"/>
+      </w:pPr>
+      <w:r>
+        <w:t xml:space="preserve">1.1 VIP </w:t>
+      </w:r>
+      <w:r>
+        <w:rPr>
+          <w:rFonts w:hint="eastAsia"/>
+        </w:rPr>
+        <w:t xml:space="preserve">会员服务是平台向符合条件用户提供的付费会员权益服务，包括</w:t>
+      </w:r>
+      <w:r>
+        <w:t xml:space="preserve"> VIP </w:t>
+      </w:r>
+      <w:r>
+        <w:rPr>
+          <w:rFonts w:hint="eastAsia"/>
+        </w:rPr>
+        <w:t xml:space="preserve">身份标识、会员价格或折扣、包邮权益、专属礼包、推荐奖励、消费积分规则及优先客服等页面展示的权益。</w:t>
+      </w:r>
+    </w:p>
+    <w:p>
+      <w:pPr>
+        <w:pStyle w:val="BodyText"/>
+      </w:pPr>
+      <w:r>
+        <w:t xml:space="preserve">1.2 </w:t>
+      </w:r>
+      <w:r>
+        <w:rPr>
+          <w:rFonts w:hint="eastAsia"/>
+        </w:rPr>
+        <w:t xml:space="preserve">当前版本</w:t>
+      </w:r>
+      <w:r>
+        <w:t xml:space="preserve"> VIP </w:t>
+      </w:r>
+      <w:r>
+        <w:rPr>
+          <w:rFonts w:hint="eastAsia"/>
+        </w:rPr>
+        <w:t xml:space="preserve">开通方式为一次性支付购买</w:t>
+      </w:r>
+      <w:r>
+        <w:t xml:space="preserve"> VIP </w:t>
+      </w:r>
+      <w:r>
+        <w:rPr>
+          <w:rFonts w:hint="eastAsia"/>
+        </w:rPr>
+        <w:t xml:space="preserve">礼包，不包含自动续费、连续包月或默认续订。若未来新增自动续费或订阅制会员，平台将在支付前另行以醒目方式展示续费规则并征得您的单独确认。</w:t>
+      </w:r>
+    </w:p>
+    <w:p>
+      <w:pPr>
+        <w:pStyle w:val="BodyText"/>
+      </w:pPr>
+      <w:r>
+        <w:t xml:space="preserve">1.3 VIP </w:t>
+      </w:r>
+      <w:r>
+        <w:rPr>
+          <w:rFonts w:hint="eastAsia"/>
+        </w:rPr>
+        <w:t xml:space="preserve">礼包档位、价格、赠品方案、推荐奖励比例和具体权益，以您支付前</w:t>
+      </w:r>
+      <w:r>
+        <w:t xml:space="preserve"> App </w:t>
+      </w:r>
+      <w:r>
+        <w:rPr>
+          <w:rFonts w:hint="eastAsia"/>
+        </w:rPr>
+        <w:t xml:space="preserve">页面实时展示及平台后台配置为准。</w:t>
+      </w:r>
+    </w:p>
+    <w:bookmarkEnd w:id="39"/>
+    <w:bookmarkStart w:id="40" w:name="二开通与支付"/>
+    <w:p>
+      <w:pPr>
+        <w:pStyle w:val="Heading2"/>
+      </w:pPr>
+      <w:r>
+        <w:rPr>
+          <w:rFonts w:hint="eastAsia"/>
+        </w:rPr>
+        <w:t xml:space="preserve">二、开通与支付</w:t>
+      </w:r>
+    </w:p>
+    <w:p>
+      <w:pPr>
+        <w:pStyle w:val="FirstParagraph"/>
+      </w:pPr>
+      <w:r>
+        <w:t xml:space="preserve">2.1 </w:t>
+      </w:r>
+      <w:r>
+        <w:rPr>
+          <w:rFonts w:hint="eastAsia"/>
+        </w:rPr>
+        <w:t xml:space="preserve">您需登录本人账号、选择</w:t>
+      </w:r>
+      <w:r>
+        <w:t xml:space="preserve"> VIP </w:t>
+      </w:r>
+      <w:r>
+        <w:rPr>
+          <w:rFonts w:hint="eastAsia"/>
+        </w:rPr>
+        <w:t xml:space="preserve">礼包及赠品方案、填写收货地址，并在支付界面确认订单金额和支付方式后，方可发起会员开通支付。</w:t>
+      </w:r>
+    </w:p>
+    <w:p>
+      <w:pPr>
+        <w:pStyle w:val="BodyText"/>
+      </w:pPr>
+      <w:r>
+        <w:t xml:space="preserve">2.2 VIP </w:t>
+      </w:r>
+      <w:r>
+        <w:rPr>
+          <w:rFonts w:hint="eastAsia"/>
+        </w:rPr>
+        <w:t xml:space="preserve">仅在支付成功并经平台系统确认后开通。点击”立即开通”、创建待支付订单或拉起支付组件本身，不代表</w:t>
+      </w:r>
+      <w:r>
+        <w:t xml:space="preserve"> VIP </w:t>
+      </w:r>
+      <w:r>
+        <w:rPr>
+          <w:rFonts w:hint="eastAsia"/>
+        </w:rPr>
+        <w:t xml:space="preserve">已经生效。</w:t>
+      </w:r>
+    </w:p>
+    <w:p>
+      <w:pPr>
+        <w:pStyle w:val="BodyText"/>
+      </w:pPr>
+      <w:r>
+        <w:t xml:space="preserve">2.3 VIP </w:t>
+      </w:r>
+      <w:r>
+        <w:rPr>
+          <w:rFonts w:hint="eastAsia"/>
+        </w:rPr>
+        <w:t xml:space="preserve">礼包订单包邮，不参与普通商品满减、消费积分抵扣、平台红包抵扣及普通/VIP</w:t>
+      </w:r>
+      <w:r>
+        <w:t xml:space="preserve"> </w:t>
+      </w:r>
+      <w:r>
+        <w:rPr>
+          <w:rFonts w:hint="eastAsia"/>
+        </w:rPr>
+        <w:t xml:space="preserve">上溯有效消费计数，也不计入累计消费金额或信用资产。</w:t>
+      </w:r>
+    </w:p>
+    <w:p>
+      <w:pPr>
+        <w:pStyle w:val="BodyText"/>
+      </w:pPr>
+      <w:r>
+        <w:t xml:space="preserve">2.4 </w:t>
+      </w:r>
+      <w:r>
+        <w:rPr>
+          <w:rFonts w:hint="eastAsia"/>
+        </w:rPr>
+        <w:t xml:space="preserve">若支付过程中出现取消、超时、失败或支付渠道结果延迟，平台将依据支付渠道回调、主动查单及订单状态进行处理；未确认支付成功前，VIP</w:t>
+      </w:r>
+      <w:r>
+        <w:t xml:space="preserve"> </w:t>
+      </w:r>
+      <w:r>
+        <w:rPr>
+          <w:rFonts w:hint="eastAsia"/>
+        </w:rPr>
+        <w:t xml:space="preserve">不会提前开通。</w:t>
+      </w:r>
+    </w:p>
+    <w:bookmarkEnd w:id="40"/>
+    <w:bookmarkStart w:id="41" w:name="三会员权益"/>
+    <w:p>
+      <w:pPr>
+        <w:pStyle w:val="Heading2"/>
+      </w:pPr>
+      <w:r>
+        <w:rPr>
+          <w:rFonts w:hint="eastAsia"/>
+        </w:rPr>
+        <w:t xml:space="preserve">三、会员权益</w:t>
+      </w:r>
+    </w:p>
+    <w:p>
+      <w:pPr>
+        <w:pStyle w:val="FirstParagraph"/>
+      </w:pPr>
+      <w:r>
+        <w:t xml:space="preserve">3.1 VIP </w:t>
+      </w:r>
+      <w:r>
+        <w:rPr>
+          <w:rFonts w:hint="eastAsia"/>
+        </w:rPr>
+        <w:t xml:space="preserve">会员可享受平台页面展示的会员权益，包括但不限于会员身份展示、部分商品会员价或折扣、包邮门槛优化、专属礼包、推荐好友开通</w:t>
+      </w:r>
+      <w:r>
+        <w:t xml:space="preserve"> VIP </w:t>
+      </w:r>
+      <w:r>
+        <w:rPr>
+          <w:rFonts w:hint="eastAsia"/>
+        </w:rPr>
+        <w:t xml:space="preserve">后的奖励及优先客服等。</w:t>
+      </w:r>
+    </w:p>
+    <w:p>
+      <w:pPr>
+        <w:pStyle w:val="BodyText"/>
+      </w:pPr>
+      <w:r>
+        <w:t xml:space="preserve">3.2 </w:t>
+      </w:r>
+      <w:r>
+        <w:rPr>
+          <w:rFonts w:hint="eastAsia"/>
+        </w:rPr>
+        <w:t xml:space="preserve">会员权益的适用商品、适用场景、折扣比例、奖励规则、发放时点、冻结或解锁条件，以</w:t>
+      </w:r>
+      <w:r>
+        <w:t xml:space="preserve"> App </w:t>
+      </w:r>
+      <w:r>
+        <w:rPr>
+          <w:rFonts w:hint="eastAsia"/>
+        </w:rPr>
+        <w:t xml:space="preserve">页面、活动规则和平台配置为准。</w:t>
+      </w:r>
+    </w:p>
+    <w:p>
+      <w:pPr>
+        <w:pStyle w:val="BodyText"/>
+      </w:pPr>
+      <w:r>
+        <w:t xml:space="preserve">3.3 </w:t>
+      </w:r>
+      <w:r>
+        <w:rPr>
+          <w:rFonts w:hint="eastAsia"/>
+        </w:rPr>
+        <w:t xml:space="preserve">消费积分、推荐奖励等权益属于平台规则下的虚拟权益，不具备法定货币属性，不得转让、倒卖、私下交易或承诺增值收益。</w:t>
+      </w:r>
+    </w:p>
+    <w:p>
+      <w:pPr>
+        <w:pStyle w:val="BodyText"/>
+      </w:pPr>
+      <w:r>
+        <w:rPr>
+          <w:b/>
+          <w:bCs/>
+        </w:rPr>
+        <w:t xml:space="preserve">3.4 </w:t>
+      </w:r>
+      <w:r>
+        <w:rPr>
+          <w:rFonts w:hint="eastAsia"/>
+          <w:b/>
+          <w:bCs/>
+        </w:rPr>
+        <w:t xml:space="preserve">数字资产规则：VIP</w:t>
+      </w:r>
+      <w:r>
+        <w:rPr>
+          <w:b/>
+          <w:bCs/>
+        </w:rPr>
+        <w:t xml:space="preserve"> </w:t>
+      </w:r>
+      <w:r>
+        <w:rPr>
+          <w:rFonts w:hint="eastAsia"/>
+          <w:b/>
+          <w:bCs/>
+        </w:rPr>
+        <w:t xml:space="preserve">开通后，您可按平台公示规则拥有并展示数字资产余额。数字资产包括种子资产和信用资产，仅为平台账号内记录的数字化权益，不是现金、储值余额、证券、股权份额或可流通代币，不承诺固定收益、保本增值、现金兑换、股权/期权/工资折算或其他回报。数字资产不可转让、不可交易、不可赠送、不可倒卖、不可转售。</w:t>
+      </w:r>
+    </w:p>
+    <w:p>
+      <w:pPr>
+        <w:pStyle w:val="BodyText"/>
+      </w:pPr>
+      <w:r>
+        <w:t xml:space="preserve">3.5 </w:t>
+      </w:r>
+      <w:r>
+        <w:rPr>
+          <w:rFonts w:hint="eastAsia"/>
+        </w:rPr>
+        <w:t xml:space="preserve">种子资产仅来源于您本人购买</w:t>
+      </w:r>
+      <w:r>
+        <w:t xml:space="preserve"> VIP </w:t>
+      </w:r>
+      <w:r>
+        <w:rPr>
+          <w:rFonts w:hint="eastAsia"/>
+        </w:rPr>
+        <w:t xml:space="preserve">礼包以及您直接邀请好友购买</w:t>
+      </w:r>
+      <w:r>
+        <w:t xml:space="preserve"> VIP </w:t>
+      </w:r>
+      <w:r>
+        <w:rPr>
+          <w:rFonts w:hint="eastAsia"/>
+        </w:rPr>
+        <w:t xml:space="preserve">礼包两类场景，且仅发放给本人或直接邀请人；不会向间接上级扩散。信用资产由累计消费金额按平台可配置倍率档位计算；普通用户仅记录累计消费金额，不展示数字资产余额。后台可调整未来生效规则，但历史流水以入账时保存的规则快照和台账记录为准。</w:t>
+      </w:r>
+    </w:p>
+    <w:p>
+      <w:pPr>
+        <w:pStyle w:val="BodyText"/>
+      </w:pPr>
+      <w:r>
+        <w:t xml:space="preserve">3.6 </w:t>
+      </w:r>
+      <w:r>
+        <w:rPr>
+          <w:rFonts w:hint="eastAsia"/>
+        </w:rPr>
+        <w:t xml:space="preserve">数字资产未来是否开放使用、兑换、折现、收益或权益转换等功能尚未确定；除平台后续正式公示规则外，任何页面展示、宣传或沟通均不构成对现金价值、股权比例、固定回报或其他未公布权益的承诺。</w:t>
+      </w:r>
+    </w:p>
+    <w:bookmarkEnd w:id="41"/>
+    <w:bookmarkStart w:id="42" w:name="四退款与售后"/>
+    <w:p>
+      <w:pPr>
+        <w:pStyle w:val="Heading2"/>
+      </w:pPr>
+      <w:r>
+        <w:rPr>
+          <w:rFonts w:hint="eastAsia"/>
+        </w:rPr>
+        <w:t xml:space="preserve">四、退款与售后</w:t>
+      </w:r>
+    </w:p>
+    <w:p>
+      <w:pPr>
+        <w:pStyle w:val="FirstParagraph"/>
+      </w:pPr>
+      <w:r>
+        <w:rPr>
+          <w:b/>
+          <w:bCs/>
+        </w:rPr>
+        <w:t xml:space="preserve">4.1 VIP </w:t>
+      </w:r>
+      <w:r>
+        <w:rPr>
+          <w:rFonts w:hint="eastAsia"/>
+          <w:b/>
+          <w:bCs/>
+        </w:rPr>
+        <w:t xml:space="preserve">礼包用于开通会员服务并附带赠品履约。支付成功且</w:t>
+      </w:r>
+      <w:r>
+        <w:rPr>
+          <w:b/>
+          <w:bCs/>
+        </w:rPr>
+        <w:t xml:space="preserve"> VIP </w:t>
+      </w:r>
+      <w:r>
+        <w:rPr>
+          <w:rFonts w:hint="eastAsia"/>
+          <w:b/>
+          <w:bCs/>
+        </w:rPr>
+        <w:t xml:space="preserve">生效后，除法律法规另有规定、平台明确承诺或因平台原因导致服务无法提供外，VIP</w:t>
+      </w:r>
+      <w:r>
+        <w:rPr>
+          <w:b/>
+          <w:bCs/>
+        </w:rPr>
+        <w:t xml:space="preserve"> </w:t>
+      </w:r>
+      <w:r>
+        <w:rPr>
+          <w:rFonts w:hint="eastAsia"/>
+          <w:b/>
+          <w:bCs/>
+        </w:rPr>
+        <w:t xml:space="preserve">会员服务费用不支持无理由退款。</w:t>
+      </w:r>
+    </w:p>
+    <w:p>
+      <w:pPr>
+        <w:pStyle w:val="BodyText"/>
+      </w:pPr>
+      <w:r>
+        <w:t xml:space="preserve">4.2 VIP </w:t>
+      </w:r>
+      <w:r>
+        <w:rPr>
+          <w:rFonts w:hint="eastAsia"/>
+        </w:rPr>
+        <w:t xml:space="preserve">礼包中的实物赠品如存在质量、错发、漏发、物流损坏等问题，平台将依据商品售后规则协助处理补发、换货或其他合理售后方案；该售后不当然导致</w:t>
+      </w:r>
+      <w:r>
+        <w:t xml:space="preserve"> VIP </w:t>
+      </w:r>
+      <w:r>
+        <w:rPr>
+          <w:rFonts w:hint="eastAsia"/>
+        </w:rPr>
+        <w:t xml:space="preserve">会员服务费用退还。</w:t>
+      </w:r>
+    </w:p>
+    <w:p>
+      <w:pPr>
+        <w:pStyle w:val="BodyText"/>
+      </w:pPr>
+      <w:r>
+        <w:t xml:space="preserve">4.3 </w:t>
+      </w:r>
+      <w:r>
+        <w:rPr>
+          <w:rFonts w:hint="eastAsia"/>
+        </w:rPr>
+        <w:t xml:space="preserve">如因重复扣款、支付异常或系统错误产生需退款情形，平台核实后将按原支付路径处理。</w:t>
+      </w:r>
+    </w:p>
+    <w:bookmarkEnd w:id="42"/>
+    <w:bookmarkStart w:id="43" w:name="五使用规范与违规处理"/>
+    <w:p>
+      <w:pPr>
+        <w:pStyle w:val="Heading2"/>
+      </w:pPr>
+      <w:r>
+        <w:rPr>
+          <w:rFonts w:hint="eastAsia"/>
+        </w:rPr>
+        <w:t xml:space="preserve">五、使用规范与违规处理</w:t>
+      </w:r>
+    </w:p>
+    <w:p>
+      <w:pPr>
+        <w:pStyle w:val="FirstParagraph"/>
+      </w:pPr>
+      <w:r>
+        <w:t xml:space="preserve">5.1 </w:t>
+      </w:r>
+      <w:r>
+        <w:rPr>
+          <w:rFonts w:hint="eastAsia"/>
+        </w:rPr>
+        <w:t xml:space="preserve">您应以真实、合法、合规方式开通和使用</w:t>
+      </w:r>
+      <w:r>
+        <w:t xml:space="preserve"> VIP </w:t>
+      </w:r>
+      <w:r>
+        <w:rPr>
+          <w:rFonts w:hint="eastAsia"/>
+        </w:rPr>
+        <w:t xml:space="preserve">会员服务，不得利用脚本、外挂、批量账号、虚假交易、虚假邀请、恶意售后、套利或其他不正当方式获取会员权益或奖励。</w:t>
+      </w:r>
+    </w:p>
+    <w:p>
+      <w:pPr>
+        <w:pStyle w:val="BodyText"/>
+      </w:pPr>
+      <w:r>
+        <w:t xml:space="preserve">5.2 </w:t>
+      </w:r>
+      <w:r>
+        <w:rPr>
+          <w:rFonts w:hint="eastAsia"/>
+        </w:rPr>
+        <w:t xml:space="preserve">若平台发现您存在违反法律法规、用户协议、本协议或活动规则的行为，有权采取限制会员权益、撤销违规奖励、冻结或封禁账号、清零违规所得等措施，并保留追究法律责任的权利。</w:t>
+      </w:r>
+    </w:p>
+    <w:bookmarkEnd w:id="43"/>
+    <w:bookmarkStart w:id="44" w:name="六权益终止与账号注销"/>
+    <w:p>
+      <w:pPr>
+        <w:pStyle w:val="Heading2"/>
+      </w:pPr>
+      <w:r>
+        <w:rPr>
+          <w:rFonts w:hint="eastAsia"/>
+        </w:rPr>
+        <w:t xml:space="preserve">六、权益终止与账号注销</w:t>
+      </w:r>
+    </w:p>
+    <w:p>
+      <w:pPr>
+        <w:pStyle w:val="FirstParagraph"/>
+      </w:pPr>
+      <w:r>
+        <w:t xml:space="preserve">6.1 </w:t>
+      </w:r>
+      <w:r>
+        <w:rPr>
+          <w:rFonts w:hint="eastAsia"/>
+        </w:rPr>
+        <w:t xml:space="preserve">因账号注销、账号违规封禁、平台依法依规处置或法律法规要求导致账号终止使用的，VIP</w:t>
+      </w:r>
+      <w:r>
+        <w:t xml:space="preserve"> </w:t>
+      </w:r>
+      <w:r>
+        <w:rPr>
+          <w:rFonts w:hint="eastAsia"/>
+        </w:rPr>
+        <w:t xml:space="preserve">会员权益将同步终止。</w:t>
+      </w:r>
+    </w:p>
+    <w:p>
+      <w:pPr>
+        <w:pStyle w:val="BodyText"/>
+      </w:pPr>
+      <w:r>
+        <w:rPr>
+          <w:b/>
+          <w:bCs/>
+        </w:rPr>
+        <w:t xml:space="preserve">6.2 </w:t>
+      </w:r>
+      <w:r>
+        <w:rPr>
+          <w:rFonts w:hint="eastAsia"/>
+          <w:b/>
+          <w:bCs/>
+        </w:rPr>
+        <w:t xml:space="preserve">用户主动注销账号时，账号下</w:t>
+      </w:r>
+      <w:r>
+        <w:rPr>
+          <w:b/>
+          <w:bCs/>
+        </w:rPr>
+        <w:t xml:space="preserve"> VIP </w:t>
+      </w:r>
+      <w:r>
+        <w:rPr>
+          <w:rFonts w:hint="eastAsia"/>
+          <w:b/>
+          <w:bCs/>
+        </w:rPr>
+        <w:t xml:space="preserve">会员权益、推荐码展示与分享权益、数字资产（含种子资产、信用资产）、未发放或冻结中的奖励、消费积分、平台红包等权益将按《用户协议》《隐私政策》及注销页面提示即时清零作废，不予恢复、折现、转让或补偿。严重违规封禁或平台依法依规处置时，数字资产也可按同类规则清零或终止展示。</w:t>
+      </w:r>
+    </w:p>
+    <w:p>
+      <w:pPr>
+        <w:pStyle w:val="BodyText"/>
+      </w:pPr>
+      <w:r>
+        <w:t xml:space="preserve">6.3 </w:t>
+      </w:r>
+      <w:r>
+        <w:rPr>
+          <w:rFonts w:hint="eastAsia"/>
+        </w:rPr>
+        <w:t xml:space="preserve">已支付订单、售后、退款、发票、支付记录、审计日志等依法需留存的信息，将按照法律法规和《隐私政策》要求处理。</w:t>
+      </w:r>
+    </w:p>
+    <w:bookmarkEnd w:id="44"/>
+    <w:bookmarkStart w:id="45" w:name="七个人信息保护"/>
+    <w:p>
+      <w:pPr>
+        <w:pStyle w:val="Heading2"/>
+      </w:pPr>
+      <w:r>
+        <w:rPr>
+          <w:rFonts w:hint="eastAsia"/>
+        </w:rPr>
+        <w:t xml:space="preserve">七、个人信息保护</w:t>
+      </w:r>
+    </w:p>
+    <w:p>
+      <w:pPr>
+        <w:pStyle w:val="FirstParagraph"/>
+      </w:pPr>
+      <w:r>
+        <w:t xml:space="preserve">7.1 </w:t>
+      </w:r>
+      <w:r>
+        <w:rPr>
+          <w:rFonts w:hint="eastAsia"/>
+        </w:rPr>
+        <w:t xml:space="preserve">平台因会员开通、订单履约、赠品发货、支付结算、推荐奖励、售后服务等需要处理您的账号信息、订单信息、收货信息、支付状态和必要设备信息。</w:t>
+      </w:r>
+    </w:p>
+    <w:p>
+      <w:pPr>
+        <w:pStyle w:val="BodyText"/>
+      </w:pPr>
+      <w:r>
+        <w:t xml:space="preserve">7.2 </w:t>
+      </w:r>
+      <w:r>
+        <w:rPr>
+          <w:rFonts w:hint="eastAsia"/>
+        </w:rPr>
+        <w:t xml:space="preserve">平台将按照《AI爱买买APP隐私政策》处理和保护您的个人信息，依法采取安全措施，并仅在实现会员服务及法律法规要求的必要范围内使用相关信息。</w:t>
+      </w:r>
+    </w:p>
+    <w:bookmarkEnd w:id="45"/>
+    <w:bookmarkStart w:id="46" w:name="八协议更新与争议解决"/>
+    <w:p>
+      <w:pPr>
+        <w:pStyle w:val="Heading2"/>
+      </w:pPr>
+      <w:r>
+        <w:rPr>
+          <w:rFonts w:hint="eastAsia"/>
+        </w:rPr>
+        <w:t xml:space="preserve">八、协议更新与争议解决</w:t>
+      </w:r>
+    </w:p>
+    <w:p>
+      <w:pPr>
+        <w:pStyle w:val="FirstParagraph"/>
+      </w:pPr>
+      <w:r>
+        <w:t xml:space="preserve">8.1 </w:t>
+      </w:r>
+      <w:r>
+        <w:rPr>
+          <w:rFonts w:hint="eastAsia"/>
+        </w:rPr>
+        <w:t xml:space="preserve">平台可因法律法规、监管要求、业务调整或会员权益变化修订本协议。修订后将通过</w:t>
+      </w:r>
+      <w:r>
+        <w:t xml:space="preserve"> App </w:t>
+      </w:r>
+      <w:r>
+        <w:rPr>
+          <w:rFonts w:hint="eastAsia"/>
+        </w:rPr>
+        <w:t xml:space="preserve">页面、弹窗、公告或协议页面公示，依法需要重新取得同意的，平台将另行征得您的确认。</w:t>
+      </w:r>
+    </w:p>
+    <w:p>
+      <w:pPr>
+        <w:pStyle w:val="BodyText"/>
+      </w:pPr>
+      <w:r>
+        <w:t xml:space="preserve">8.2 </w:t>
+      </w:r>
+      <w:r>
+        <w:rPr>
+          <w:rFonts w:hint="eastAsia"/>
+        </w:rPr>
+        <w:t xml:space="preserve">本协议的订立、履行、解释及争议解决适用中华人民共和国大陆地区法律。因本协议产生争议的，双方应先友好协商；协商不成的，任何一方可向平台运营主体所在地有管辖权的人民法院提起诉讼。</w:t>
+      </w:r>
+    </w:p>
+    <w:bookmarkEnd w:id="46"/>
+    <w:bookmarkEnd w:id="47"/>
     <w:sectPr>
       <w:footnotePr>
         <w:numRestart w:val="eachSect"/>
@@ -4249,6 +5339,12 @@
     <w:abstractNumId w:val="991"/>
   </w:num>
   <w:num w:numId="1025">
+    <w:abstractNumId w:val="991"/>
+  </w:num>
+  <w:num w:numId="1026">
+    <w:abstractNumId w:val="991"/>
+  </w:num>
+  <w:num w:numId="1027">
     <w:abstractNumId w:val="991"/>
   </w:num>
 </w:numbering>

</xml_diff>

<commit_message>
fix(digital-asset): rename credit assets to consumption assets
</commit_message>
<xml_diff>
--- a/docs/legal/爱买买法律文本审核稿.docx
+++ b/docs/legal/爱买买法律文本审核稿.docx
@@ -48,7 +48,7 @@
         <w:rPr>
           <w:rFonts w:hint="eastAsia"/>
         </w:rPr>
-        <w:t xml:space="preserve">内嵌的《隐私政策》《用户协议》原文导出为</w:t>
+        <w:t xml:space="preserve">内嵌的《隐私政策》《用户协议》《会员服务协议》原文导出为</w:t>
       </w:r>
       <w:r>
         <w:t xml:space="preserve"> </w:t>
@@ -1060,7 +1060,7 @@
           <w:b/>
           <w:bCs/>
         </w:rPr>
-        <w:t xml:space="preserve">（1）数字资产性质：数字资产包括种子资产和信用资产，仅为平台根据公示规则在用户账号内记录和展示的数字化权益，不是现金、储值余额、存款、证券、股权份额或可流通代币，不承诺固定收益、保本增值、现金兑换、股权/期权/工资折算或其他回报。数字资产不可在用户之间转让、交易、赠送、倒卖或转售。</w:t>
+        <w:t xml:space="preserve">（1）数字资产性质：数字资产包括种子资产和消费资产，仅为平台根据公示规则在用户账号内记录和展示的数字化权益，不是现金、储值余额、存款、证券、股权份额或可流通代币，不承诺固定收益、保本增值、现金兑换、股权/期权/工资折算或其他回报。数字资产不可在用户之间转让、交易、赠送、倒卖或转售。</w:t>
       </w:r>
     </w:p>
     <w:p>
@@ -1106,7 +1106,7 @@
         <w:rPr>
           <w:rFonts w:hint="eastAsia"/>
         </w:rPr>
-        <w:t xml:space="preserve">（3）累计消费与入账口径：累计消费金额适用于所有用户，仅按普通商品实付商品金额计算，不含运费、平台红包抵扣、消费积分抵扣及</w:t>
+        <w:t xml:space="preserve">（3）累计消费与入账口径：累计消费金额适用于所有用户，只按普通商品真实实付商品金额计算，不含运费、平台红包抵扣、消费积分抵扣及普通商品</w:t>
       </w:r>
       <w:r>
         <w:t xml:space="preserve"> VIP </w:t>
@@ -1124,7 +1124,7 @@
         <w:rPr>
           <w:rFonts w:hint="eastAsia"/>
         </w:rPr>
-        <w:t xml:space="preserve">礼包订单不计入累计消费金额，也不直接产生信用资产。种子资产仅来源于本人购买</w:t>
+        <w:t xml:space="preserve">礼包订单不计入累计消费金额，也不直接产生消费资产。种子资产仅来源于本人购买</w:t>
       </w:r>
       <w:r>
         <w:t xml:space="preserve"> VIP </w:t>
@@ -1142,7 +1142,7 @@
         <w:rPr>
           <w:rFonts w:hint="eastAsia"/>
         </w:rPr>
-        <w:t xml:space="preserve">礼包两类场景，且仅发放给本人或直接邀请人；信用资产按平台可配置的累计消费倍率档位计算。平台配置修改通常仅影响后续行为，已形成的历史流水以入账时保存的规则快照、订单信息和台账记录解释。</w:t>
+        <w:t xml:space="preserve">礼包两类场景，且仅发放给本人或直接邀请人；消费资产按平台可配置的累计消费倍率档位计算。平台配置修改通常仅影响后续行为，已形成的历史流水以入账时保存的规则快照、订单信息和台账记录解释。</w:t>
       </w:r>
     </w:p>
     <w:p>
@@ -1505,7 +1505,7 @@
           <w:b/>
           <w:bCs/>
         </w:rPr>
-        <w:t xml:space="preserve">（5）虚拟资产即时清零作废（含钱包可提现余额）：提交注销的瞬间，您账号下的消费积分、数字资产（含种子资产、信用资产）、分润奖励（含待发放/冻结中/可提现部分）、平台红包与优惠券、VIP</w:t>
+        <w:t xml:space="preserve">（5）虚拟资产即时清零作废（含钱包可提现余额）：提交注销的瞬间，您账号下的消费积分、数字资产（含种子资产、消费资产）、分润奖励（含待发放/冻结中/可提现部分）、平台红包与优惠券、VIP</w:t>
       </w:r>
       <w:r>
         <w:rPr>
@@ -3611,7 +3611,7 @@
           <w:b/>
           <w:bCs/>
         </w:rPr>
-        <w:t xml:space="preserve">数字资产边界：本平台数字资产包括种子资产和信用资产，仅为平台根据公示规则在用户账号内记录和展示的数字化权益，不是现金、储值余额、存款、理财、证券、股权份额或可流通代币，不构成对用户的固定收益、保本增值、现金兑换、股权/期权/工资折算或其他回报承诺。数字资产不可转让、不可交易、不可赠送、不可倒卖、不可转售。未来是否开放使用、兑换、折现、权益转换等功能，以平台后续正式公示规则为准；在正式公示前，任何页面展示、宣传或沟通均不视为平台承诺。</w:t>
+        <w:t xml:space="preserve">数字资产边界：本平台数字资产包括种子资产和消费资产，仅为平台根据公示规则在用户账号内记录和展示的数字化权益，不是现金、储值余额、存款、理财、证券、股权份额或可流通代币，不构成对用户的固定收益、保本增值、现金兑换、股权/期权/工资折算或其他回报承诺。数字资产不可转让、不可交易、不可赠送、不可倒卖、不可转售。未来是否开放使用、兑换、折现、权益转换等功能，以平台后续正式公示规则为准；在正式公示前，任何页面展示、宣传或沟通均不视为平台承诺。</w:t>
       </w:r>
     </w:p>
     <w:p>
@@ -3643,7 +3643,7 @@
         <w:rPr>
           <w:rFonts w:hint="eastAsia"/>
         </w:rPr>
-        <w:t xml:space="preserve">激活引导。累计消费金额适用于所有用户，仅按普通商品实付商品金额计算，不含运费、平台红包抵扣、消费积分抵扣及</w:t>
+        <w:t xml:space="preserve">激活引导。累计消费金额适用于所有用户，只按普通商品真实实付商品金额计算，不含运费、平台红包抵扣、消费积分抵扣及普通商品</w:t>
       </w:r>
       <w:r>
         <w:t xml:space="preserve"> VIP </w:t>
@@ -3661,7 +3661,7 @@
         <w:rPr>
           <w:rFonts w:hint="eastAsia"/>
         </w:rPr>
-        <w:t xml:space="preserve">礼包订单不计入累计消费金额，也不直接产生信用资产。种子资产仅来源于用户本人购买</w:t>
+        <w:t xml:space="preserve">礼包订单不计入累计消费金额，也不直接产生消费资产。种子资产仅来源于用户本人购买</w:t>
       </w:r>
       <w:r>
         <w:t xml:space="preserve"> VIP </w:t>
@@ -3679,7 +3679,7 @@
         <w:rPr>
           <w:rFonts w:hint="eastAsia"/>
         </w:rPr>
-        <w:t xml:space="preserve">礼包两类场景，且仅发放给本人或直接邀请人，不向间接上级扩散。信用资产按平台可配置的累计消费倍率档位计算，具体入账数量、来源、快照规则、历史流水解释和后续规则调整，以交易时或入账时保存的平台流水快照及当时公示规则为准；后台修改后的数值通常仅影响后续行为，不当然追溯已经形成的历史流水。</w:t>
+        <w:t xml:space="preserve">礼包两类场景，且仅发放给本人或直接邀请人，不向间接上级扩散。消费资产按平台可配置的累计消费倍率档位计算，具体入账数量、来源、快照规则、历史流水解释和后续规则调整，以交易时或入账时保存的平台流水快照及当时公示规则为准；后台修改后的数值通常仅影响后续行为，不当然追溯已经形成的历史流水。</w:t>
       </w:r>
     </w:p>
     <w:p>
@@ -3777,7 +3777,7 @@
           <w:b/>
           <w:bCs/>
         </w:rPr>
-        <w:t xml:space="preserve">虚拟资产即时清零作废（含钱包可提现现金）：账号注销提交的瞬间，用户账号下消费积分、数字资产（含种子资产、信用资产）、分润奖励（含待发放、冻结中及可提现部分）、平台红包与优惠券、VIP</w:t>
+        <w:t xml:space="preserve">虚拟资产即时清零作废（含钱包可提现现金）：账号注销提交的瞬间，用户账号下消费积分、数字资产（含种子资产、消费资产）、分润奖励（含待发放、冻结中及可提现部分）、平台红包与优惠券、VIP</w:t>
       </w:r>
       <w:r>
         <w:rPr>
@@ -4542,7 +4542,7 @@
         <w:rPr>
           <w:rFonts w:hint="eastAsia"/>
         </w:rPr>
-        <w:t xml:space="preserve">上溯有效消费计数，也不计入累计消费金额或信用资产。</w:t>
+        <w:t xml:space="preserve">上溯有效消费计数，也不计入累计消费金额或消费资产。</w:t>
       </w:r>
     </w:p>
     <w:p>
@@ -4673,7 +4673,7 @@
           <w:b/>
           <w:bCs/>
         </w:rPr>
-        <w:t xml:space="preserve">开通后，您可按平台公示规则拥有并展示数字资产余额。数字资产包括种子资产和信用资产，仅为平台账号内记录的数字化权益，不是现金、储值余额、证券、股权份额或可流通代币，不承诺固定收益、保本增值、现金兑换、股权/期权/工资折算或其他回报。数字资产不可转让、不可交易、不可赠送、不可倒卖、不可转售。</w:t>
+        <w:t xml:space="preserve">开通后，您可按平台公示规则拥有并展示数字资产余额。数字资产包括种子资产和消费资产，仅为平台账号内记录的数字化权益，不是现金、储值余额、证券、股权份额或可流通代币，不承诺固定收益、保本增值、现金兑换、股权/期权/工资折算或其他回报。数字资产不可转让、不可交易、不可赠送、不可倒卖、不可转售。</w:t>
       </w:r>
     </w:p>
     <w:p>
@@ -4705,7 +4705,7 @@
         <w:rPr>
           <w:rFonts w:hint="eastAsia"/>
         </w:rPr>
-        <w:t xml:space="preserve">礼包两类场景，且仅发放给本人或直接邀请人；不会向间接上级扩散。信用资产由累计消费金额按平台可配置倍率档位计算；普通用户仅记录累计消费金额，不展示数字资产余额。后台可调整未来生效规则，但历史流水以入账时保存的规则快照和台账记录为准。</w:t>
+        <w:t xml:space="preserve">礼包两类场景，且仅发放给本人或直接邀请人；不会向间接上级扩散。消费资产由累计消费金额按平台可配置倍率档位计算；普通用户仅记录累计消费金额，不展示数字资产余额。后台可调整未来生效规则，但历史流水以入账时保存的规则快照和台账记录为准。</w:t>
       </w:r>
     </w:p>
     <w:p>
@@ -4940,7 +4940,7 @@
           <w:b/>
           <w:bCs/>
         </w:rPr>
-        <w:t xml:space="preserve">会员权益、推荐码展示与分享权益、数字资产（含种子资产、信用资产）、未发放或冻结中的奖励、消费积分、平台红包等权益将按《用户协议》《隐私政策》及注销页面提示即时清零作废，不予恢复、折现、转让或补偿。严重违规封禁或平台依法依规处置时，数字资产也可按同类规则清零或终止展示。</w:t>
+        <w:t xml:space="preserve">会员权益、推荐码展示与分享权益、数字资产（含种子资产、消费资产）、未发放或冻结中的奖励、消费积分、平台红包等权益将按《用户协议》《隐私政策》及注销页面提示即时清零作废，不予恢复、折现、转让或补偿。严重违规封禁或平台依法依规处置时，数字资产也可按同类规则清零或终止展示。</w:t>
       </w:r>
     </w:p>
     <w:p>

</xml_diff>

<commit_message>
fix(legal): remove unused map provider disclosure
</commit_message>
<xml_diff>
--- a/docs/legal/爱买买法律文本审核稿.docx
+++ b/docs/legal/爱买买法律文本审核稿.docx
@@ -2503,7 +2503,16 @@
         <w:rPr>
           <w:rFonts w:hint="eastAsia"/>
         </w:rPr>
-        <w:t xml:space="preserve">地图与位置类</w:t>
+        <w:t xml:space="preserve">语音与</w:t>
+      </w:r>
+      <w:r>
+        <w:t xml:space="preserve"> AI </w:t>
+      </w:r>
+      <w:r>
+        <w:rPr>
+          <w:rFonts w:hint="eastAsia"/>
+        </w:rPr>
+        <w:t xml:space="preserve">类</w:t>
       </w:r>
     </w:p>
     <w:p>
@@ -2518,7 +2527,7 @@
         <w:rPr>
           <w:rFonts w:hint="eastAsia"/>
         </w:rPr>
-        <w:t xml:space="preserve">高德地图开放平台（高德软件有限公司）—</w:t>
+        <w:t xml:space="preserve">大语言模型服务（供应商待定）—</w:t>
       </w:r>
       <w:r>
         <w:t xml:space="preserve"> </w:t>
@@ -2527,7 +2536,7 @@
         <w:rPr>
           <w:rFonts w:hint="eastAsia"/>
         </w:rPr>
-        <w:t xml:space="preserve">用途：地址解析、POI</w:t>
+        <w:t xml:space="preserve">用途：AI</w:t>
       </w:r>
       <w:r>
         <w:t xml:space="preserve"> </w:t>
@@ -2536,7 +2545,7 @@
         <w:rPr>
           <w:rFonts w:hint="eastAsia"/>
         </w:rPr>
-        <w:t xml:space="preserve">搜索、地图展示；共享字段：经纬度、地址文本；隐私政策：https://lbs.amap.com/pages/privacy/</w:t>
+        <w:t xml:space="preserve">客服、意图识别、智能搜索；共享字段：脱敏后的文本对话</w:t>
       </w:r>
     </w:p>
     <w:p>
@@ -2547,21 +2556,11 @@
         <w:rPr>
           <w:rFonts w:hint="eastAsia"/>
         </w:rPr>
-        <w:t xml:space="preserve">语音与</w:t>
-      </w:r>
-      <w:r>
-        <w:t xml:space="preserve"> AI </w:t>
-      </w:r>
-      <w:r>
-        <w:rPr>
-          <w:rFonts w:hint="eastAsia"/>
-        </w:rPr>
-        <w:t xml:space="preserve">类</w:t>
-      </w:r>
-    </w:p>
-    <w:p>
-      <w:pPr>
-        <w:pStyle w:val="Compact"/>
+        <w:t xml:space="preserve">物流类</w:t>
+      </w:r>
+    </w:p>
+    <w:p>
+      <w:pPr>
         <w:numPr>
           <w:ilvl w:val="0"/>
           <w:numId w:val="1021"/>
@@ -2571,7 +2570,7 @@
         <w:rPr>
           <w:rFonts w:hint="eastAsia"/>
         </w:rPr>
-        <w:t xml:space="preserve">大语言模型服务（供应商待定）—</w:t>
+        <w:t xml:space="preserve">顺丰开放平台（顺丰速运有限公司）—</w:t>
       </w:r>
       <w:r>
         <w:t xml:space="preserve"> </w:t>
@@ -2580,7 +2579,21 @@
         <w:rPr>
           <w:rFonts w:hint="eastAsia"/>
         </w:rPr>
-        <w:t xml:space="preserve">用途：AI</w:t>
+        <w:t xml:space="preserve">用途：物流下单、运单查询；共享字段：收件人姓名、脱敏手机号、地址</w:t>
+      </w:r>
+    </w:p>
+    <w:p>
+      <w:pPr>
+        <w:numPr>
+          <w:ilvl w:val="0"/>
+          <w:numId w:val="1021"/>
+        </w:numPr>
+      </w:pPr>
+      <w:r>
+        <w:rPr>
+          <w:rFonts w:hint="eastAsia"/>
+        </w:rPr>
+        <w:t xml:space="preserve">快递</w:t>
       </w:r>
       <w:r>
         <w:t xml:space="preserve"> </w:t>
@@ -2589,7 +2602,16 @@
         <w:rPr>
           <w:rFonts w:hint="eastAsia"/>
         </w:rPr>
-        <w:t xml:space="preserve">客服、意图识别、智能搜索；共享字段：脱敏后的文本对话</w:t>
+        <w:t xml:space="preserve">100（深圳市快递壹佰网络科技有限公司）—</w:t>
+      </w:r>
+      <w:r>
+        <w:t xml:space="preserve"> </w:t>
+      </w:r>
+      <w:r>
+        <w:rPr>
+          <w:rFonts w:hint="eastAsia"/>
+        </w:rPr>
+        <w:t xml:space="preserve">用途：物流轨迹查询；共享字段：运单号</w:t>
       </w:r>
     </w:p>
     <w:p>
@@ -2600,7 +2622,7 @@
         <w:rPr>
           <w:rFonts w:hint="eastAsia"/>
         </w:rPr>
-        <w:t xml:space="preserve">物流类</w:t>
+        <w:t xml:space="preserve">系统与框架类（不涉及个人信息外传）</w:t>
       </w:r>
     </w:p>
     <w:p>
@@ -2611,10 +2633,13 @@
         </w:numPr>
       </w:pPr>
       <w:r>
-        <w:rPr>
-          <w:rFonts w:hint="eastAsia"/>
-        </w:rPr>
-        <w:t xml:space="preserve">顺丰开放平台（顺丰速运有限公司）—</w:t>
+        <w:t xml:space="preserve">Expo </w:t>
+      </w:r>
+      <w:r>
+        <w:rPr>
+          <w:rFonts w:hint="eastAsia"/>
+        </w:rPr>
+        <w:t xml:space="preserve">运行时（Expo,</w:t>
       </w:r>
       <w:r>
         <w:t xml:space="preserve"> </w:t>
@@ -2623,7 +2648,25 @@
         <w:rPr>
           <w:rFonts w:hint="eastAsia"/>
         </w:rPr>
-        <w:t xml:space="preserve">用途：物流下单、运单查询；共享字段：收件人姓名、脱敏手机号、地址</w:t>
+        <w:t xml:space="preserve">Inc.）—</w:t>
+      </w:r>
+      <w:r>
+        <w:t xml:space="preserve"> </w:t>
+      </w:r>
+      <w:r>
+        <w:rPr>
+          <w:rFonts w:hint="eastAsia"/>
+        </w:rPr>
+        <w:t xml:space="preserve">用途：App</w:t>
+      </w:r>
+      <w:r>
+        <w:t xml:space="preserve"> </w:t>
+      </w:r>
+      <w:r>
+        <w:rPr>
+          <w:rFonts w:hint="eastAsia"/>
+        </w:rPr>
+        <w:t xml:space="preserve">运行框架；隐私政策：https://expo.dev/privacy</w:t>
       </w:r>
     </w:p>
     <w:p>
@@ -2634,10 +2677,22 @@
         </w:numPr>
       </w:pPr>
       <w:r>
-        <w:rPr>
-          <w:rFonts w:hint="eastAsia"/>
-        </w:rPr>
-        <w:t xml:space="preserve">快递</w:t>
+        <w:t xml:space="preserve">React </w:t>
+      </w:r>
+      <w:r>
+        <w:rPr>
+          <w:rFonts w:hint="eastAsia"/>
+        </w:rPr>
+        <w:t xml:space="preserve">Native（Meta</w:t>
+      </w:r>
+      <w:r>
+        <w:t xml:space="preserve"> Platforms, </w:t>
+      </w:r>
+      <w:r>
+        <w:rPr>
+          <w:rFonts w:hint="eastAsia"/>
+        </w:rPr>
+        <w:t xml:space="preserve">Inc.）—</w:t>
       </w:r>
       <w:r>
         <w:t xml:space="preserve"> </w:t>
@@ -2646,105 +2701,6 @@
         <w:rPr>
           <w:rFonts w:hint="eastAsia"/>
         </w:rPr>
-        <w:t xml:space="preserve">100（深圳市快递壹佰网络科技有限公司）—</w:t>
-      </w:r>
-      <w:r>
-        <w:t xml:space="preserve"> </w:t>
-      </w:r>
-      <w:r>
-        <w:rPr>
-          <w:rFonts w:hint="eastAsia"/>
-        </w:rPr>
-        <w:t xml:space="preserve">用途：物流轨迹查询；共享字段：运单号</w:t>
-      </w:r>
-    </w:p>
-    <w:p>
-      <w:pPr>
-        <w:pStyle w:val="BlockText"/>
-      </w:pPr>
-      <w:r>
-        <w:rPr>
-          <w:rFonts w:hint="eastAsia"/>
-        </w:rPr>
-        <w:t xml:space="preserve">系统与框架类（不涉及个人信息外传）</w:t>
-      </w:r>
-    </w:p>
-    <w:p>
-      <w:pPr>
-        <w:numPr>
-          <w:ilvl w:val="0"/>
-          <w:numId w:val="1023"/>
-        </w:numPr>
-      </w:pPr>
-      <w:r>
-        <w:t xml:space="preserve">Expo </w:t>
-      </w:r>
-      <w:r>
-        <w:rPr>
-          <w:rFonts w:hint="eastAsia"/>
-        </w:rPr>
-        <w:t xml:space="preserve">运行时（Expo,</w:t>
-      </w:r>
-      <w:r>
-        <w:t xml:space="preserve"> </w:t>
-      </w:r>
-      <w:r>
-        <w:rPr>
-          <w:rFonts w:hint="eastAsia"/>
-        </w:rPr>
-        <w:t xml:space="preserve">Inc.）—</w:t>
-      </w:r>
-      <w:r>
-        <w:t xml:space="preserve"> </w:t>
-      </w:r>
-      <w:r>
-        <w:rPr>
-          <w:rFonts w:hint="eastAsia"/>
-        </w:rPr>
-        <w:t xml:space="preserve">用途：App</w:t>
-      </w:r>
-      <w:r>
-        <w:t xml:space="preserve"> </w:t>
-      </w:r>
-      <w:r>
-        <w:rPr>
-          <w:rFonts w:hint="eastAsia"/>
-        </w:rPr>
-        <w:t xml:space="preserve">运行框架；隐私政策：https://expo.dev/privacy</w:t>
-      </w:r>
-    </w:p>
-    <w:p>
-      <w:pPr>
-        <w:numPr>
-          <w:ilvl w:val="0"/>
-          <w:numId w:val="1023"/>
-        </w:numPr>
-      </w:pPr>
-      <w:r>
-        <w:t xml:space="preserve">React </w:t>
-      </w:r>
-      <w:r>
-        <w:rPr>
-          <w:rFonts w:hint="eastAsia"/>
-        </w:rPr>
-        <w:t xml:space="preserve">Native（Meta</w:t>
-      </w:r>
-      <w:r>
-        <w:t xml:space="preserve"> Platforms, </w:t>
-      </w:r>
-      <w:r>
-        <w:rPr>
-          <w:rFonts w:hint="eastAsia"/>
-        </w:rPr>
-        <w:t xml:space="preserve">Inc.）—</w:t>
-      </w:r>
-      <w:r>
-        <w:t xml:space="preserve"> </w:t>
-      </w:r>
-      <w:r>
-        <w:rPr>
-          <w:rFonts w:hint="eastAsia"/>
-        </w:rPr>
         <w:t xml:space="preserve">用途：跨平台框架</w:t>
       </w:r>
     </w:p>
@@ -2752,7 +2708,7 @@
       <w:pPr>
         <w:numPr>
           <w:ilvl w:val="0"/>
-          <w:numId w:val="1023"/>
+          <w:numId w:val="1022"/>
         </w:numPr>
       </w:pPr>
       <w:r>
@@ -2913,7 +2869,7 @@
         <w:pStyle w:val="Compact"/>
         <w:numPr>
           <w:ilvl w:val="0"/>
-          <w:numId w:val="1024"/>
+          <w:numId w:val="1023"/>
         </w:numPr>
       </w:pPr>
       <w:r>
@@ -2937,7 +2893,7 @@
         <w:pStyle w:val="Compact"/>
         <w:numPr>
           <w:ilvl w:val="0"/>
-          <w:numId w:val="1024"/>
+          <w:numId w:val="1023"/>
         </w:numPr>
       </w:pPr>
       <w:r>
@@ -3139,7 +3095,7 @@
       <w:pPr>
         <w:numPr>
           <w:ilvl w:val="0"/>
-          <w:numId w:val="1025"/>
+          <w:numId w:val="1024"/>
         </w:numPr>
       </w:pPr>
       <w:r>
@@ -3153,7 +3109,7 @@
       <w:pPr>
         <w:numPr>
           <w:ilvl w:val="0"/>
-          <w:numId w:val="1025"/>
+          <w:numId w:val="1024"/>
         </w:numPr>
       </w:pPr>
       <w:r>
@@ -3167,7 +3123,7 @@
       <w:pPr>
         <w:numPr>
           <w:ilvl w:val="0"/>
-          <w:numId w:val="1025"/>
+          <w:numId w:val="1024"/>
         </w:numPr>
       </w:pPr>
       <w:r>
@@ -3181,7 +3137,7 @@
       <w:pPr>
         <w:numPr>
           <w:ilvl w:val="0"/>
-          <w:numId w:val="1025"/>
+          <w:numId w:val="1024"/>
         </w:numPr>
       </w:pPr>
       <w:r>
@@ -3195,7 +3151,7 @@
       <w:pPr>
         <w:numPr>
           <w:ilvl w:val="0"/>
-          <w:numId w:val="1025"/>
+          <w:numId w:val="1024"/>
         </w:numPr>
       </w:pPr>
       <w:r>
@@ -3264,7 +3220,7 @@
       <w:pPr>
         <w:numPr>
           <w:ilvl w:val="0"/>
-          <w:numId w:val="1026"/>
+          <w:numId w:val="1025"/>
         </w:numPr>
       </w:pPr>
       <w:r>
@@ -3278,7 +3234,7 @@
       <w:pPr>
         <w:numPr>
           <w:ilvl w:val="0"/>
-          <w:numId w:val="1026"/>
+          <w:numId w:val="1025"/>
         </w:numPr>
       </w:pPr>
       <w:r>
@@ -3292,7 +3248,7 @@
       <w:pPr>
         <w:numPr>
           <w:ilvl w:val="0"/>
-          <w:numId w:val="1026"/>
+          <w:numId w:val="1025"/>
         </w:numPr>
       </w:pPr>
       <w:r>
@@ -3306,7 +3262,7 @@
       <w:pPr>
         <w:numPr>
           <w:ilvl w:val="0"/>
-          <w:numId w:val="1026"/>
+          <w:numId w:val="1025"/>
         </w:numPr>
       </w:pPr>
       <w:r>
@@ -3320,7 +3276,7 @@
       <w:pPr>
         <w:numPr>
           <w:ilvl w:val="0"/>
-          <w:numId w:val="1026"/>
+          <w:numId w:val="1025"/>
         </w:numPr>
       </w:pPr>
       <w:r>
@@ -3334,7 +3290,7 @@
       <w:pPr>
         <w:numPr>
           <w:ilvl w:val="0"/>
-          <w:numId w:val="1026"/>
+          <w:numId w:val="1025"/>
         </w:numPr>
       </w:pPr>
       <w:r>
@@ -4311,7 +4267,7 @@
         <w:pStyle w:val="Compact"/>
         <w:numPr>
           <w:ilvl w:val="0"/>
-          <w:numId w:val="1027"/>
+          <w:numId w:val="1026"/>
         </w:numPr>
       </w:pPr>
       <w:r>
@@ -4362,7 +4318,7 @@
         <w:pStyle w:val="Compact"/>
         <w:numPr>
           <w:ilvl w:val="0"/>
-          <w:numId w:val="1027"/>
+          <w:numId w:val="1026"/>
         </w:numPr>
       </w:pPr>
       <w:r>
@@ -5342,9 +5298,6 @@
     <w:abstractNumId w:val="991"/>
   </w:num>
   <w:num w:numId="1026">
-    <w:abstractNumId w:val="991"/>
-  </w:num>
-  <w:num w:numId="1027">
     <w:abstractNumId w:val="991"/>
   </w:num>
 </w:numbering>

</xml_diff>